<commit_message>
feat(report): deliver pixel-perfect single file for Lab 1 and Lab 1b homework assignments
</commit_message>
<xml_diff>
--- a/Lab1_Lab1b_Homework_25560063_DoAnhTuan.docx
+++ b/Lab1_Lab1b_Homework_25560063_DoAnhTuan.docx
@@ -4,164 +4,115 @@
   <w:body>
     <w:p>
       <w:pPr>
-        <w:pStyle w:val="Title"/>
+        <w:spacing w:after="80"/>
+        <w:jc w:val="center"/>
       </w:pPr>
       <w:r>
         <w:rPr>
-          <w:rFonts w:ascii="Times New Roman" w:hAnsi="Times New Roman" w:eastAsia="Times New Roman" w:cs="Times New Roman"/>
-          <w:spacing w:val="0"/>
-          <w:w w:val="100"/>
-          <w:position w:val="0"/>
-          <w:sz w:val="38"/>
-          <w:szCs w:val="38"/>
-          <w:i w:val="0"/>
-          <w:iCs w:val="0"/>
+          <w:rFonts w:ascii="Segoe UI" w:hAnsi="Segoe UI"/>
+          <w:b/>
+          <w:color w:val="0F172A"/>
+          <w:sz w:val="40"/>
         </w:rPr>
         <w:t>Lab 1 and Lab 1b Homework Practical Report</w:t>
       </w:r>
     </w:p>
     <w:p>
       <w:pPr>
-        <w:pStyle w:val="Subtitle"/>
+        <w:spacing w:after="280"/>
+        <w:jc w:val="center"/>
       </w:pPr>
       <w:r>
         <w:rPr>
-          <w:rFonts w:ascii="Times New Roman" w:hAnsi="Times New Roman" w:eastAsia="Times New Roman" w:cs="Times New Roman"/>
-          <w:spacing w:val="0"/>
-          <w:w w:val="100"/>
-          <w:position w:val="0"/>
-          <w:sz w:val="22"/>
-          <w:szCs w:val="22"/>
-          <w:i w:val="0"/>
-          <w:iCs w:val="0"/>
+          <w:rFonts w:ascii="Segoe UI" w:hAnsi="Segoe UI"/>
+          <w:color w:val="475569"/>
+          <w:sz w:val="21"/>
         </w:rPr>
-        <w:t>Đỗ Anh Tuấn    Student ID: 25560063    Class: BCU</w:t>
+        <w:t>Student: Đỗ Anh Tuấn   |   Student ID: 25560063   |   Class: BCU</w:t>
+        <w:br/>
+        <w:t>Email: erenererophu@gmail.com   |   Course: Web Application &amp; Database Development</w:t>
       </w:r>
     </w:p>
     <w:p>
       <w:pPr>
-        <w:pStyle w:val="Heading2"/>
+        <w:spacing w:after="320"/>
+        <w:jc w:val="center"/>
       </w:pPr>
       <w:r>
         <w:rPr>
-          <w:rFonts w:ascii="Times New Roman" w:hAnsi="Times New Roman" w:eastAsia="Times New Roman" w:cs="Times New Roman"/>
-          <w:spacing w:val="0"/>
-          <w:w w:val="100"/>
-          <w:position w:val="0"/>
-          <w:sz w:val="24"/>
-          <w:szCs w:val="24"/>
-          <w:i w:val="0"/>
-          <w:iCs w:val="0"/>
+          <w:rFonts w:ascii="Segoe UI" w:hAnsi="Segoe UI"/>
+          <w:b/>
+          <w:sz w:val="21"/>
         </w:rPr>
-        <w:t>Source Code Repository</w:t>
+        <w:t xml:space="preserve">Source Code Repository: </w:t>
       </w:r>
-    </w:p>
-    <w:p>
-      <w:hyperlink r:id="rId10">
-        <w:r>
-          <w:rPr>
-            <w:rFonts w:ascii="Times New Roman" w:hAnsi="Times New Roman" w:eastAsia="Times New Roman" w:cs="Times New Roman"/>
-            <w:color w:val="000000"/>
-            <w:u w:val="single"/>
-            <w:spacing w:val="0"/>
-            <w:w w:val="100"/>
-            <w:position w:val="0"/>
-            <w:sz w:val="22"/>
-            <w:szCs w:val="22"/>
-            <w:i w:val="0"/>
-            <w:iCs w:val="0"/>
-          </w:rPr>
-          <w:t>https://github.com/RenE2703/web-backend-lab1</w:t>
-        </w:r>
-      </w:hyperlink>
-    </w:p>
-    <w:p>
       <w:r>
-        <w:br w:type="page"/>
+        <w:rPr>
+          <w:rFonts w:ascii="Segoe UI" w:hAnsi="Segoe UI"/>
+          <w:color w:val="0284C7"/>
+          <w:sz w:val="21"/>
+        </w:rPr>
+        <w:t>https://github.com/RenE2703/web-backend-lab1</w:t>
       </w:r>
     </w:p>
     <w:p>
       <w:pPr>
-        <w:pStyle w:val="Heading1"/>
+        <w:spacing w:before="320" w:after="120"/>
       </w:pPr>
       <w:r>
         <w:rPr>
-          <w:rFonts w:ascii="Times New Roman" w:hAnsi="Times New Roman" w:eastAsia="Times New Roman" w:cs="Times New Roman"/>
-          <w:spacing w:val="0"/>
-          <w:w w:val="100"/>
-          <w:position w:val="0"/>
-          <w:sz w:val="28"/>
-          <w:szCs w:val="28"/>
-          <w:i w:val="0"/>
-          <w:iCs w:val="0"/>
+          <w:rFonts w:ascii="Segoe UI" w:hAnsi="Segoe UI"/>
+          <w:b/>
+          <w:color w:val="1E3A8A"/>
+          <w:sz w:val="30"/>
         </w:rPr>
-        <w:t>Lab 1 - Homework 1: Library Management Database</w:t>
+        <w:t>PART 1: LAB 1 - HOMEWORK ASSIGNMENTS</w:t>
       </w:r>
     </w:p>
     <w:p>
       <w:pPr>
-        <w:pStyle w:val="Heading2"/>
+        <w:spacing w:before="240" w:after="80"/>
       </w:pPr>
       <w:r>
         <w:rPr>
-          <w:rFonts w:ascii="Times New Roman" w:hAnsi="Times New Roman" w:eastAsia="Times New Roman" w:cs="Times New Roman"/>
-          <w:spacing w:val="0"/>
-          <w:w w:val="100"/>
-          <w:position w:val="0"/>
-          <w:sz w:val="24"/>
-          <w:szCs w:val="24"/>
-          <w:i w:val="0"/>
-          <w:iCs w:val="0"/>
+          <w:rFonts w:ascii="Segoe UI" w:hAnsi="Segoe UI"/>
+          <w:b/>
+          <w:color w:val="111827"/>
+          <w:sz w:val="25"/>
         </w:rPr>
-        <w:t>Database Design &amp; Schema Setup (DDL)</w:t>
+        <w:t>1.1. Homework 1: Library Management Database (MySQL Relational Design &amp; DDL/DQL)</w:t>
       </w:r>
     </w:p>
     <w:p>
       <w:pPr>
-        <w:spacing w:after="160"/>
+        <w:spacing w:after="120"/>
       </w:pPr>
       <w:r>
         <w:rPr>
-          <w:rFonts w:ascii="Times New Roman" w:hAnsi="Times New Roman" w:eastAsia="Times New Roman" w:cs="Times New Roman"/>
-          <w:spacing w:val="0"/>
-          <w:w w:val="100"/>
-          <w:position w:val="0"/>
-          <w:sz w:val="22"/>
-          <w:szCs w:val="22"/>
-          <w:i w:val="0"/>
-          <w:iCs w:val="0"/>
+          <w:rFonts w:ascii="Segoe UI" w:hAnsi="Segoe UI"/>
+          <w:color w:val="334155"/>
+          <w:sz w:val="20"/>
         </w:rPr>
-        <w:t>Thiết kế cơ sở dữ liệu quan hệ library_db chuẩn hóa dạng 3NF gồm 3 thực thể authors, books, và borrow_records. Ràng buộc toàn vẹn tham chiếu khóa ngoại FOREIGN KEY được thiết lập với cơ chế ON DELETE CASCADE nhằm đảm bảo tính nhất quán dữ liệu khi xóa bản ghi cha.</w:t>
+        <w:t>Requirements: Design a relational database named 'library_db' with 3 interconnected tables using foreign keys:</w:t>
+        <w:br/>
+        <w:t>• authors: id (PK), author_name, nationality</w:t>
+        <w:br/>
+        <w:t>• books: id (PK), title, author_id (FK referencing authors.id), category, publish_year</w:t>
+        <w:br/>
+        <w:t>• borrow_records: id (PK), book_id (FK referencing books.id), borrower_name, borrow_date, return_date</w:t>
+        <w:br/>
+        <w:t>Insert at least 3 records per table and write an SQL 3-table INNER JOIN query to display: Book Title, Author Name, Borrower Name, and Borrow Date.</w:t>
       </w:r>
     </w:p>
     <w:p>
       <w:pPr>
-        <w:pStyle w:val="Heading3"/>
-      </w:pPr>
-      <w:r>
-        <w:rPr>
-          <w:rFonts w:ascii="Times New Roman" w:hAnsi="Times New Roman" w:eastAsia="Times New Roman" w:cs="Times New Roman"/>
-          <w:spacing w:val="0"/>
-          <w:w w:val="100"/>
-          <w:position w:val="0"/>
-          <w:sz w:val="20"/>
-          <w:szCs w:val="20"/>
-          <w:i w:val="0"/>
-          <w:iCs w:val="0"/>
-        </w:rPr>
-        <w:t>Source code</w:t>
-      </w:r>
-    </w:p>
-    <w:p>
-      <w:pPr>
-        <w:keepLines/>
-        <w:spacing w:after="120"/>
+        <w:spacing w:before="80" w:after="40"/>
         <w:jc w:val="center"/>
       </w:pPr>
       <w:r>
         <w:drawing>
           <wp:inline xmlns:a="http://schemas.openxmlformats.org/drawingml/2006/main" xmlns:pic="http://schemas.openxmlformats.org/drawingml/2006/picture">
-            <wp:extent cx="4722482" cy="5029200"/>
+            <wp:extent cx="6217920" cy="6621764"/>
             <wp:docPr id="1" name="Picture 1"/>
             <wp:cNvGraphicFramePr>
               <a:graphicFrameLocks noChangeAspect="1"/>
@@ -174,7 +125,7 @@
                     <pic:cNvPicPr/>
                   </pic:nvPicPr>
                   <pic:blipFill>
-                    <a:blip r:embed="rId11"/>
+                    <a:blip r:embed="rId9"/>
                     <a:stretch>
                       <a:fillRect/>
                     </a:stretch>
@@ -182,14 +133,9 @@
                   <pic:spPr>
                     <a:xfrm>
                       <a:off x="0" y="0"/>
-                      <a:ext cx="4722482" cy="5029200"/>
+                      <a:ext cx="6217920" cy="6621764"/>
                     </a:xfrm>
                     <a:prstGeom prst="rect"/>
-                    <a:ln w="6350">
-                      <a:solidFill>
-                        <a:srgbClr val="666666"/>
-                      </a:solidFill>
-                    </a:ln>
                   </pic:spPr>
                 </pic:pic>
               </a:graphicData>
@@ -199,92 +145,29 @@
       </w:r>
     </w:p>
     <w:p>
+      <w:pPr>
+        <w:spacing w:before="60" w:after="200"/>
+        <w:jc w:val="center"/>
+      </w:pPr>
       <w:r>
-        <w:br w:type="page"/>
+        <w:rPr>
+          <w:rFonts w:ascii="Segoe UI" w:hAnsi="Segoe UI"/>
+          <w:i/>
+          <w:color w:val="64748B"/>
+          <w:sz w:val="19"/>
+        </w:rPr>
+        <w:t>Figure 1.1: Database Schema Setup (DDL) and Table Definitions in VS Code</w:t>
       </w:r>
     </w:p>
     <w:p>
       <w:pPr>
-        <w:pStyle w:val="Heading1"/>
-      </w:pPr>
-      <w:r>
-        <w:rPr>
-          <w:rFonts w:ascii="Times New Roman" w:hAnsi="Times New Roman" w:eastAsia="Times New Roman" w:cs="Times New Roman"/>
-          <w:spacing w:val="0"/>
-          <w:w w:val="100"/>
-          <w:position w:val="0"/>
-          <w:sz w:val="28"/>
-          <w:szCs w:val="28"/>
-          <w:i w:val="0"/>
-          <w:iCs w:val="0"/>
-        </w:rPr>
-        <w:t>Lab 1 - Homework 1: Library Management Database</w:t>
-      </w:r>
-    </w:p>
-    <w:p>
-      <w:pPr>
-        <w:pStyle w:val="Heading2"/>
-      </w:pPr>
-      <w:r>
-        <w:rPr>
-          <w:rFonts w:ascii="Times New Roman" w:hAnsi="Times New Roman" w:eastAsia="Times New Roman" w:cs="Times New Roman"/>
-          <w:spacing w:val="0"/>
-          <w:w w:val="100"/>
-          <w:position w:val="0"/>
-          <w:sz w:val="24"/>
-          <w:szCs w:val="24"/>
-          <w:i w:val="0"/>
-          <w:iCs w:val="0"/>
-        </w:rPr>
-        <w:t>Sample Data &amp; Three-Table INNER JOIN Query</w:t>
-      </w:r>
-    </w:p>
-    <w:p>
-      <w:pPr>
-        <w:spacing w:after="160"/>
-      </w:pPr>
-      <w:r>
-        <w:rPr>
-          <w:rFonts w:ascii="Times New Roman" w:hAnsi="Times New Roman" w:eastAsia="Times New Roman" w:cs="Times New Roman"/>
-          <w:spacing w:val="0"/>
-          <w:w w:val="100"/>
-          <w:position w:val="0"/>
-          <w:sz w:val="22"/>
-          <w:szCs w:val="22"/>
-          <w:i w:val="0"/>
-          <w:iCs w:val="0"/>
-        </w:rPr>
-        <w:t>Nạp dữ liệu thử nghiệm đại diện và thực thi câu lệnh truy vấn phức hợp 3 bảng INNER JOIN liên kết giữa tác giả, sách và lượt mượn. Truy vấn áp dụng định dạng chuỗi ngày tháng DATE_FORMAT và sắp xếp theo trình tự thời gian mượn sách.</w:t>
-      </w:r>
-    </w:p>
-    <w:p>
-      <w:pPr>
-        <w:pStyle w:val="Heading3"/>
-      </w:pPr>
-      <w:r>
-        <w:rPr>
-          <w:rFonts w:ascii="Times New Roman" w:hAnsi="Times New Roman" w:eastAsia="Times New Roman" w:cs="Times New Roman"/>
-          <w:spacing w:val="0"/>
-          <w:w w:val="100"/>
-          <w:position w:val="0"/>
-          <w:sz w:val="20"/>
-          <w:szCs w:val="20"/>
-          <w:i w:val="0"/>
-          <w:iCs w:val="0"/>
-        </w:rPr>
-        <w:t>Source code</w:t>
-      </w:r>
-    </w:p>
-    <w:p>
-      <w:pPr>
-        <w:keepLines/>
-        <w:spacing w:after="120"/>
+        <w:spacing w:before="80" w:after="40"/>
         <w:jc w:val="center"/>
       </w:pPr>
       <w:r>
         <w:drawing>
           <wp:inline xmlns:a="http://schemas.openxmlformats.org/drawingml/2006/main" xmlns:pic="http://schemas.openxmlformats.org/drawingml/2006/picture">
-            <wp:extent cx="4722482" cy="5029200"/>
+            <wp:extent cx="6217920" cy="6621764"/>
             <wp:docPr id="2" name="Picture 2"/>
             <wp:cNvGraphicFramePr>
               <a:graphicFrameLocks noChangeAspect="1"/>
@@ -297,7 +180,7 @@
                     <pic:cNvPicPr/>
                   </pic:nvPicPr>
                   <pic:blipFill>
-                    <a:blip r:embed="rId12"/>
+                    <a:blip r:embed="rId10"/>
                     <a:stretch>
                       <a:fillRect/>
                     </a:stretch>
@@ -305,14 +188,9 @@
                   <pic:spPr>
                     <a:xfrm>
                       <a:off x="0" y="0"/>
-                      <a:ext cx="4722482" cy="5029200"/>
+                      <a:ext cx="6217920" cy="6621764"/>
                     </a:xfrm>
                     <a:prstGeom prst="rect"/>
-                    <a:ln w="6350">
-                      <a:solidFill>
-                        <a:srgbClr val="666666"/>
-                      </a:solidFill>
-                    </a:ln>
                   </pic:spPr>
                 </pic:pic>
               </a:graphicData>
@@ -323,32 +201,28 @@
     </w:p>
     <w:p>
       <w:pPr>
-        <w:pStyle w:val="Heading3"/>
+        <w:spacing w:before="60" w:after="200"/>
+        <w:jc w:val="center"/>
       </w:pPr>
       <w:r>
         <w:rPr>
-          <w:rFonts w:ascii="Times New Roman" w:hAnsi="Times New Roman" w:eastAsia="Times New Roman" w:cs="Times New Roman"/>
-          <w:spacing w:val="0"/>
-          <w:w w:val="100"/>
-          <w:position w:val="0"/>
-          <w:sz w:val="20"/>
-          <w:szCs w:val="20"/>
-          <w:i w:val="0"/>
-          <w:iCs w:val="0"/>
+          <w:rFonts w:ascii="Segoe UI" w:hAnsi="Segoe UI"/>
+          <w:i/>
+          <w:color w:val="64748B"/>
+          <w:sz w:val="19"/>
         </w:rPr>
-        <w:t>Terminal output</w:t>
+        <w:t>Figure 1.2: Seed Data Insertion and 3-Table INNER JOIN SQL Query in VS Code</w:t>
       </w:r>
     </w:p>
     <w:p>
       <w:pPr>
-        <w:keepLines/>
-        <w:spacing w:after="120"/>
+        <w:spacing w:before="80" w:after="40"/>
         <w:jc w:val="center"/>
       </w:pPr>
       <w:r>
         <w:drawing>
           <wp:inline xmlns:a="http://schemas.openxmlformats.org/drawingml/2006/main" xmlns:pic="http://schemas.openxmlformats.org/drawingml/2006/picture">
-            <wp:extent cx="4722482" cy="5029200"/>
+            <wp:extent cx="6217920" cy="6621764"/>
             <wp:docPr id="3" name="Picture 3"/>
             <wp:cNvGraphicFramePr>
               <a:graphicFrameLocks noChangeAspect="1"/>
@@ -361,7 +235,7 @@
                     <pic:cNvPicPr/>
                   </pic:nvPicPr>
                   <pic:blipFill>
-                    <a:blip r:embed="rId13"/>
+                    <a:blip r:embed="rId11"/>
                     <a:stretch>
                       <a:fillRect/>
                     </a:stretch>
@@ -369,14 +243,9 @@
                   <pic:spPr>
                     <a:xfrm>
                       <a:off x="0" y="0"/>
-                      <a:ext cx="4722482" cy="5029200"/>
+                      <a:ext cx="6217920" cy="6621764"/>
                     </a:xfrm>
                     <a:prstGeom prst="rect"/>
-                    <a:ln w="6350">
-                      <a:solidFill>
-                        <a:srgbClr val="666666"/>
-                      </a:solidFill>
-                    </a:ln>
                   </pic:spPr>
                 </pic:pic>
               </a:graphicData>
@@ -387,32 +256,28 @@
     </w:p>
     <w:p>
       <w:pPr>
-        <w:pStyle w:val="Heading3"/>
+        <w:spacing w:before="60" w:after="200"/>
+        <w:jc w:val="center"/>
       </w:pPr>
       <w:r>
         <w:rPr>
-          <w:rFonts w:ascii="Times New Roman" w:hAnsi="Times New Roman" w:eastAsia="Times New Roman" w:cs="Times New Roman"/>
-          <w:spacing w:val="0"/>
-          <w:w w:val="100"/>
-          <w:position w:val="0"/>
-          <w:sz w:val="20"/>
-          <w:szCs w:val="20"/>
-          <w:i w:val="0"/>
-          <w:iCs w:val="0"/>
+          <w:rFonts w:ascii="Segoe UI" w:hAnsi="Segoe UI"/>
+          <w:i/>
+          <w:color w:val="64748B"/>
+          <w:sz w:val="19"/>
         </w:rPr>
-        <w:t>MySQL Workbench result</w:t>
+        <w:t>Figure 1.3: Terminal Execution Output of Library Database Migration &amp; Seed</w:t>
       </w:r>
     </w:p>
     <w:p>
       <w:pPr>
-        <w:keepLines/>
-        <w:spacing w:after="120"/>
+        <w:spacing w:before="80" w:after="40"/>
         <w:jc w:val="center"/>
       </w:pPr>
       <w:r>
         <w:drawing>
           <wp:inline xmlns:a="http://schemas.openxmlformats.org/drawingml/2006/main" xmlns:pic="http://schemas.openxmlformats.org/drawingml/2006/picture">
-            <wp:extent cx="6217920" cy="4681789"/>
+            <wp:extent cx="6217920" cy="4681790"/>
             <wp:docPr id="4" name="Picture 4"/>
             <wp:cNvGraphicFramePr>
               <a:graphicFrameLocks noChangeAspect="1"/>
@@ -425,7 +290,7 @@
                     <pic:cNvPicPr/>
                   </pic:nvPicPr>
                   <pic:blipFill>
-                    <a:blip r:embed="rId14"/>
+                    <a:blip r:embed="rId12"/>
                     <a:stretch>
                       <a:fillRect/>
                     </a:stretch>
@@ -433,14 +298,9 @@
                   <pic:spPr>
                     <a:xfrm>
                       <a:off x="0" y="0"/>
-                      <a:ext cx="6217920" cy="4681789"/>
+                      <a:ext cx="6217920" cy="4681790"/>
                     </a:xfrm>
                     <a:prstGeom prst="rect"/>
-                    <a:ln w="6350">
-                      <a:solidFill>
-                        <a:srgbClr val="666666"/>
-                      </a:solidFill>
-                    </a:ln>
                   </pic:spPr>
                 </pic:pic>
               </a:graphicData>
@@ -450,92 +310,68 @@
       </w:r>
     </w:p>
     <w:p>
+      <w:pPr>
+        <w:spacing w:before="60" w:after="200"/>
+        <w:jc w:val="center"/>
+      </w:pPr>
       <w:r>
-        <w:br w:type="page"/>
+        <w:rPr>
+          <w:rFonts w:ascii="Segoe UI" w:hAnsi="Segoe UI"/>
+          <w:i/>
+          <w:color w:val="64748B"/>
+          <w:sz w:val="19"/>
+        </w:rPr>
+        <w:t>Figure 1.4: MySQL Workbench Execution - 3-Table INNER JOIN Result Grid &amp; Action Output</w:t>
       </w:r>
     </w:p>
     <w:p>
       <w:pPr>
-        <w:pStyle w:val="Heading1"/>
+        <w:spacing w:before="240" w:after="80"/>
       </w:pPr>
       <w:r>
         <w:rPr>
-          <w:rFonts w:ascii="Times New Roman" w:hAnsi="Times New Roman" w:eastAsia="Times New Roman" w:cs="Times New Roman"/>
-          <w:spacing w:val="0"/>
-          <w:w w:val="100"/>
-          <w:position w:val="0"/>
-          <w:sz w:val="28"/>
-          <w:szCs w:val="28"/>
-          <w:i w:val="0"/>
-          <w:iCs w:val="0"/>
+          <w:rFonts w:ascii="Segoe UI" w:hAnsi="Segoe UI"/>
+          <w:b/>
+          <w:color w:val="111827"/>
+          <w:sz w:val="25"/>
         </w:rPr>
-        <w:t>Lab 1 - Homework 2: MongoDB Blog System</w:t>
+        <w:t>1.2. Homework 2: Blog System NoSQL Database on MongoDB</w:t>
       </w:r>
     </w:p>
     <w:p>
       <w:pPr>
-        <w:pStyle w:val="Heading2"/>
+        <w:spacing w:after="120"/>
       </w:pPr>
       <w:r>
         <w:rPr>
-          <w:rFonts w:ascii="Times New Roman" w:hAnsi="Times New Roman" w:eastAsia="Times New Roman" w:cs="Times New Roman"/>
-          <w:spacing w:val="0"/>
-          <w:w w:val="100"/>
-          <w:position w:val="0"/>
-          <w:sz w:val="24"/>
-          <w:szCs w:val="24"/>
-          <w:i w:val="0"/>
-          <w:iCs w:val="0"/>
+          <w:rFonts w:ascii="Segoe UI" w:hAnsi="Segoe UI"/>
+          <w:color w:val="334155"/>
+          <w:sz w:val="20"/>
         </w:rPr>
-        <w:t>Document Structure &amp; Sample Posts Insertion</w:t>
+        <w:t>Requirements: Use MongoDB Compass / mongosh to manage a blog system:</w:t>
+        <w:br/>
+        <w:t>• Database: blog_db | Collection: posts</w:t>
+        <w:br/>
+        <w:t>• Insert at least 3 posts with embedded objects and arrays: title, category, views, author {name, email}, tags [array], comments [array of sub-documents].</w:t>
+        <w:br/>
+        <w:t>• Query 1: Find posts in 'Tech' category with views &gt;= 100.</w:t>
+        <w:br/>
+        <w:t>• Query 2: Find all posts tagged with 'nodejs'.</w:t>
+        <w:br/>
+        <w:t>• Update: Add a new comment to comments array using $push and increment views by 1 using $inc.</w:t>
+        <w:br/>
+        <w:t>• Aggregation: Calculate totalViews and totalPosts grouped by category.</w:t>
       </w:r>
     </w:p>
     <w:p>
       <w:pPr>
-        <w:spacing w:after="160"/>
-      </w:pPr>
-      <w:r>
-        <w:rPr>
-          <w:rFonts w:ascii="Times New Roman" w:hAnsi="Times New Roman" w:eastAsia="Times New Roman" w:cs="Times New Roman"/>
-          <w:spacing w:val="0"/>
-          <w:w w:val="100"/>
-          <w:position w:val="0"/>
-          <w:sz w:val="22"/>
-          <w:szCs w:val="22"/>
-          <w:i w:val="0"/>
-          <w:iCs w:val="0"/>
-        </w:rPr>
-        <w:t>Thiết kế cấu trúc dữ liệu NoSQL linh hoạt trên MongoDB (blog_db.posts) ứng dụng kỹ thuật nhúng (Embedding) đối tượng author và mảng tags, comments. Phương pháp này tối ưu hóa hiệu năng đọc (Read-heavy workload) bằng cách loại bỏ chi phí JOIN nhiều bảng.</w:t>
-      </w:r>
-    </w:p>
-    <w:p>
-      <w:pPr>
-        <w:pStyle w:val="Heading3"/>
-      </w:pPr>
-      <w:r>
-        <w:rPr>
-          <w:rFonts w:ascii="Times New Roman" w:hAnsi="Times New Roman" w:eastAsia="Times New Roman" w:cs="Times New Roman"/>
-          <w:spacing w:val="0"/>
-          <w:w w:val="100"/>
-          <w:position w:val="0"/>
-          <w:sz w:val="20"/>
-          <w:szCs w:val="20"/>
-          <w:i w:val="0"/>
-          <w:iCs w:val="0"/>
-        </w:rPr>
-        <w:t>Source code</w:t>
-      </w:r>
-    </w:p>
-    <w:p>
-      <w:pPr>
-        <w:keepLines/>
-        <w:spacing w:after="120"/>
+        <w:spacing w:before="80" w:after="40"/>
         <w:jc w:val="center"/>
       </w:pPr>
       <w:r>
         <w:drawing>
           <wp:inline xmlns:a="http://schemas.openxmlformats.org/drawingml/2006/main" xmlns:pic="http://schemas.openxmlformats.org/drawingml/2006/picture">
-            <wp:extent cx="4722482" cy="5029200"/>
+            <wp:extent cx="6217920" cy="6621764"/>
             <wp:docPr id="5" name="Picture 5"/>
             <wp:cNvGraphicFramePr>
               <a:graphicFrameLocks noChangeAspect="1"/>
@@ -548,7 +384,7 @@
                     <pic:cNvPicPr/>
                   </pic:nvPicPr>
                   <pic:blipFill>
-                    <a:blip r:embed="rId15"/>
+                    <a:blip r:embed="rId13"/>
                     <a:stretch>
                       <a:fillRect/>
                     </a:stretch>
@@ -556,14 +392,9 @@
                   <pic:spPr>
                     <a:xfrm>
                       <a:off x="0" y="0"/>
-                      <a:ext cx="4722482" cy="5029200"/>
+                      <a:ext cx="6217920" cy="6621764"/>
                     </a:xfrm>
                     <a:prstGeom prst="rect"/>
-                    <a:ln w="6350">
-                      <a:solidFill>
-                        <a:srgbClr val="666666"/>
-                      </a:solidFill>
-                    </a:ln>
                   </pic:spPr>
                 </pic:pic>
               </a:graphicData>
@@ -574,33 +405,84 @@
     </w:p>
     <w:p>
       <w:pPr>
-        <w:pStyle w:val="Heading3"/>
+        <w:spacing w:before="60" w:after="200"/>
+        <w:jc w:val="center"/>
       </w:pPr>
       <w:r>
         <w:rPr>
-          <w:rFonts w:ascii="Times New Roman" w:hAnsi="Times New Roman" w:eastAsia="Times New Roman" w:cs="Times New Roman"/>
-          <w:spacing w:val="0"/>
-          <w:w w:val="100"/>
-          <w:position w:val="0"/>
-          <w:sz w:val="20"/>
-          <w:szCs w:val="20"/>
-          <w:i w:val="0"/>
-          <w:iCs w:val="0"/>
+          <w:rFonts w:ascii="Segoe UI" w:hAnsi="Segoe UI"/>
+          <w:i/>
+          <w:color w:val="64748B"/>
+          <w:sz w:val="19"/>
         </w:rPr>
-        <w:t>Terminal output</w:t>
+        <w:t>Figure 1.5: MongoDB Post Schema Design and Document Ingestion Script in VS Code</w:t>
       </w:r>
     </w:p>
     <w:p>
       <w:pPr>
-        <w:keepLines/>
-        <w:spacing w:after="120"/>
+        <w:spacing w:before="80" w:after="40"/>
         <w:jc w:val="center"/>
       </w:pPr>
       <w:r>
         <w:drawing>
           <wp:inline xmlns:a="http://schemas.openxmlformats.org/drawingml/2006/main" xmlns:pic="http://schemas.openxmlformats.org/drawingml/2006/picture">
-            <wp:extent cx="4722482" cy="5029200"/>
+            <wp:extent cx="6217920" cy="6621764"/>
             <wp:docPr id="6" name="Picture 6"/>
+            <wp:cNvGraphicFramePr>
+              <a:graphicFrameLocks noChangeAspect="1"/>
+            </wp:cNvGraphicFramePr>
+            <a:graphic>
+              <a:graphicData uri="http://schemas.openxmlformats.org/drawingml/2006/picture">
+                <pic:pic>
+                  <pic:nvPicPr>
+                    <pic:cNvPr id="0" name="hw1-blog-source-queries.jpg"/>
+                    <pic:cNvPicPr/>
+                  </pic:nvPicPr>
+                  <pic:blipFill>
+                    <a:blip r:embed="rId14"/>
+                    <a:stretch>
+                      <a:fillRect/>
+                    </a:stretch>
+                  </pic:blipFill>
+                  <pic:spPr>
+                    <a:xfrm>
+                      <a:off x="0" y="0"/>
+                      <a:ext cx="6217920" cy="6621764"/>
+                    </a:xfrm>
+                    <a:prstGeom prst="rect"/>
+                  </pic:spPr>
+                </pic:pic>
+              </a:graphicData>
+            </a:graphic>
+          </wp:inline>
+        </w:drawing>
+      </w:r>
+    </w:p>
+    <w:p>
+      <w:pPr>
+        <w:spacing w:before="60" w:after="200"/>
+        <w:jc w:val="center"/>
+      </w:pPr>
+      <w:r>
+        <w:rPr>
+          <w:rFonts w:ascii="Segoe UI" w:hAnsi="Segoe UI"/>
+          <w:i/>
+          <w:color w:val="64748B"/>
+          <w:sz w:val="19"/>
+        </w:rPr>
+        <w:t>Figure 1.6: MongoDB Queries (Find, $push, $inc, and Aggregation Pipeline) in VS Code</w:t>
+      </w:r>
+    </w:p>
+    <w:p>
+      <w:pPr>
+        <w:spacing w:before="80" w:after="40"/>
+        <w:jc w:val="center"/>
+      </w:pPr>
+      <w:r>
+        <w:drawing>
+          <wp:inline xmlns:a="http://schemas.openxmlformats.org/drawingml/2006/main" xmlns:pic="http://schemas.openxmlformats.org/drawingml/2006/picture">
+            <wp:extent cx="6217920" cy="6621764"/>
+            <wp:docPr id="7" name="Picture 7"/>
             <wp:cNvGraphicFramePr>
               <a:graphicFrameLocks noChangeAspect="1"/>
             </wp:cNvGraphicFramePr>
@@ -612,7 +494,7 @@
                     <pic:cNvPicPr/>
                   </pic:nvPicPr>
                   <pic:blipFill>
-                    <a:blip r:embed="rId16"/>
+                    <a:blip r:embed="rId15"/>
                     <a:stretch>
                       <a:fillRect/>
                     </a:stretch>
@@ -620,14 +502,9 @@
                   <pic:spPr>
                     <a:xfrm>
                       <a:off x="0" y="0"/>
-                      <a:ext cx="4722482" cy="5029200"/>
+                      <a:ext cx="6217920" cy="6621764"/>
                     </a:xfrm>
                     <a:prstGeom prst="rect"/>
-                    <a:ln w="6350">
-                      <a:solidFill>
-                        <a:srgbClr val="666666"/>
-                      </a:solidFill>
-                    </a:ln>
                   </pic:spPr>
                 </pic:pic>
               </a:graphicData>
@@ -637,93 +514,30 @@
       </w:r>
     </w:p>
     <w:p>
+      <w:pPr>
+        <w:spacing w:before="60" w:after="200"/>
+        <w:jc w:val="center"/>
+      </w:pPr>
       <w:r>
-        <w:br w:type="page"/>
+        <w:rPr>
+          <w:rFonts w:ascii="Segoe UI" w:hAnsi="Segoe UI"/>
+          <w:i/>
+          <w:color w:val="64748B"/>
+          <w:sz w:val="19"/>
+        </w:rPr>
+        <w:t>Figure 1.7: Node.js / mongosh Script Execution Output for Blog Operations</w:t>
       </w:r>
     </w:p>
     <w:p>
       <w:pPr>
-        <w:pStyle w:val="Heading1"/>
-      </w:pPr>
-      <w:r>
-        <w:rPr>
-          <w:rFonts w:ascii="Times New Roman" w:hAnsi="Times New Roman" w:eastAsia="Times New Roman" w:cs="Times New Roman"/>
-          <w:spacing w:val="0"/>
-          <w:w w:val="100"/>
-          <w:position w:val="0"/>
-          <w:sz w:val="28"/>
-          <w:szCs w:val="28"/>
-          <w:i w:val="0"/>
-          <w:iCs w:val="0"/>
-        </w:rPr>
-        <w:t>Lab 1 - Homework 2: MongoDB Blog System</w:t>
-      </w:r>
-    </w:p>
-    <w:p>
-      <w:pPr>
-        <w:pStyle w:val="Heading2"/>
-      </w:pPr>
-      <w:r>
-        <w:rPr>
-          <w:rFonts w:ascii="Times New Roman" w:hAnsi="Times New Roman" w:eastAsia="Times New Roman" w:cs="Times New Roman"/>
-          <w:spacing w:val="0"/>
-          <w:w w:val="100"/>
-          <w:position w:val="0"/>
-          <w:sz w:val="24"/>
-          <w:szCs w:val="24"/>
-          <w:i w:val="0"/>
-          <w:iCs w:val="0"/>
-        </w:rPr>
-        <w:t>Query 1 &amp; Query 2 (Tech Views &gt;= 100 &amp; Nodejs Tags)</w:t>
-      </w:r>
-    </w:p>
-    <w:p>
-      <w:pPr>
-        <w:spacing w:after="160"/>
-      </w:pPr>
-      <w:r>
-        <w:rPr>
-          <w:rFonts w:ascii="Times New Roman" w:hAnsi="Times New Roman" w:eastAsia="Times New Roman" w:cs="Times New Roman"/>
-          <w:spacing w:val="0"/>
-          <w:w w:val="100"/>
-          <w:position w:val="0"/>
-          <w:sz w:val="22"/>
-          <w:szCs w:val="22"/>
-          <w:i w:val="0"/>
-          <w:iCs w:val="0"/>
-        </w:rPr>
-        <w:t>Thực hiện truy vấn lọc có điều kiện phức hợp kết hợp toán tử so sánh $gte trên trường views cùng trường category, và truy vấn tìm kiếm phần tử nằm trong mảng tags ('nodejs'). MongoDB tự động tận dụng Multikey Indexes trên mảng để tối ưu hóa tốc độ tìm kiếm.</w:t>
-      </w:r>
-    </w:p>
-    <w:p>
-      <w:pPr>
-        <w:pStyle w:val="Heading3"/>
-      </w:pPr>
-      <w:r>
-        <w:rPr>
-          <w:rFonts w:ascii="Times New Roman" w:hAnsi="Times New Roman" w:eastAsia="Times New Roman" w:cs="Times New Roman"/>
-          <w:spacing w:val="0"/>
-          <w:w w:val="100"/>
-          <w:position w:val="0"/>
-          <w:sz w:val="20"/>
-          <w:szCs w:val="20"/>
-          <w:i w:val="0"/>
-          <w:iCs w:val="0"/>
-        </w:rPr>
-        <w:t>MongoDB result</w:t>
-      </w:r>
-    </w:p>
-    <w:p>
-      <w:pPr>
-        <w:keepLines/>
-        <w:spacing w:after="120"/>
+        <w:spacing w:before="80" w:after="40"/>
         <w:jc w:val="center"/>
       </w:pPr>
       <w:r>
         <w:drawing>
           <wp:inline xmlns:a="http://schemas.openxmlformats.org/drawingml/2006/main" xmlns:pic="http://schemas.openxmlformats.org/drawingml/2006/picture">
             <wp:extent cx="6217920" cy="3342132"/>
-            <wp:docPr id="7" name="Picture 7"/>
+            <wp:docPr id="8" name="Picture 8"/>
             <wp:cNvGraphicFramePr>
               <a:graphicFrameLocks noChangeAspect="1"/>
             </wp:cNvGraphicFramePr>
@@ -735,7 +549,7 @@
                     <pic:cNvPicPr/>
                   </pic:nvPicPr>
                   <pic:blipFill>
-                    <a:blip r:embed="rId17"/>
+                    <a:blip r:embed="rId16"/>
                     <a:stretch>
                       <a:fillRect/>
                     </a:stretch>
@@ -746,134 +560,6 @@
                       <a:ext cx="6217920" cy="3342132"/>
                     </a:xfrm>
                     <a:prstGeom prst="rect"/>
-                    <a:ln w="6350">
-                      <a:solidFill>
-                        <a:srgbClr val="666666"/>
-                      </a:solidFill>
-                    </a:ln>
-                  </pic:spPr>
-                </pic:pic>
-              </a:graphicData>
-            </a:graphic>
-          </wp:inline>
-        </w:drawing>
-      </w:r>
-    </w:p>
-    <w:p>
-      <w:r>
-        <w:br w:type="page"/>
-      </w:r>
-    </w:p>
-    <w:p>
-      <w:pPr>
-        <w:pStyle w:val="Heading1"/>
-      </w:pPr>
-      <w:r>
-        <w:rPr>
-          <w:rFonts w:ascii="Times New Roman" w:hAnsi="Times New Roman" w:eastAsia="Times New Roman" w:cs="Times New Roman"/>
-          <w:spacing w:val="0"/>
-          <w:w w:val="100"/>
-          <w:position w:val="0"/>
-          <w:sz w:val="28"/>
-          <w:szCs w:val="28"/>
-          <w:i w:val="0"/>
-          <w:iCs w:val="0"/>
-        </w:rPr>
-        <w:t>Lab 1 - Homework 2: MongoDB Blog System</w:t>
-      </w:r>
-    </w:p>
-    <w:p>
-      <w:pPr>
-        <w:pStyle w:val="Heading2"/>
-      </w:pPr>
-      <w:r>
-        <w:rPr>
-          <w:rFonts w:ascii="Times New Roman" w:hAnsi="Times New Roman" w:eastAsia="Times New Roman" w:cs="Times New Roman"/>
-          <w:spacing w:val="0"/>
-          <w:w w:val="100"/>
-          <w:position w:val="0"/>
-          <w:sz w:val="24"/>
-          <w:szCs w:val="24"/>
-          <w:i w:val="0"/>
-          <w:iCs w:val="0"/>
-        </w:rPr>
-        <w:t>Update ($push &amp; $inc) and Category Aggregation</w:t>
-      </w:r>
-    </w:p>
-    <w:p>
-      <w:pPr>
-        <w:spacing w:after="160"/>
-      </w:pPr>
-      <w:r>
-        <w:rPr>
-          <w:rFonts w:ascii="Times New Roman" w:hAnsi="Times New Roman" w:eastAsia="Times New Roman" w:cs="Times New Roman"/>
-          <w:spacing w:val="0"/>
-          <w:w w:val="100"/>
-          <w:position w:val="0"/>
-          <w:sz w:val="22"/>
-          <w:szCs w:val="22"/>
-          <w:i w:val="0"/>
-          <w:iCs w:val="0"/>
-        </w:rPr>
-        <w:t>Thực thi cập nhật nguyên tử (Atomic Update) đồng thời: đẩy thêm bình luận mới vào mảng qua toán tử $push và tăng lũy kế số lượt xem bằng toán tử $inc. Pipeline Aggregation sử dụng $group để tính tổng số lượt xem và tổng bài viết theo từng danh mục.</w:t>
-      </w:r>
-    </w:p>
-    <w:p>
-      <w:pPr>
-        <w:pStyle w:val="Heading3"/>
-      </w:pPr>
-      <w:r>
-        <w:rPr>
-          <w:rFonts w:ascii="Times New Roman" w:hAnsi="Times New Roman" w:eastAsia="Times New Roman" w:cs="Times New Roman"/>
-          <w:spacing w:val="0"/>
-          <w:w w:val="100"/>
-          <w:position w:val="0"/>
-          <w:sz w:val="20"/>
-          <w:szCs w:val="20"/>
-          <w:i w:val="0"/>
-          <w:iCs w:val="0"/>
-        </w:rPr>
-        <w:t>Source code</w:t>
-      </w:r>
-    </w:p>
-    <w:p>
-      <w:pPr>
-        <w:keepLines/>
-        <w:spacing w:after="120"/>
-        <w:jc w:val="center"/>
-      </w:pPr>
-      <w:r>
-        <w:drawing>
-          <wp:inline xmlns:a="http://schemas.openxmlformats.org/drawingml/2006/main" xmlns:pic="http://schemas.openxmlformats.org/drawingml/2006/picture">
-            <wp:extent cx="4722482" cy="5029200"/>
-            <wp:docPr id="8" name="Picture 8"/>
-            <wp:cNvGraphicFramePr>
-              <a:graphicFrameLocks noChangeAspect="1"/>
-            </wp:cNvGraphicFramePr>
-            <a:graphic>
-              <a:graphicData uri="http://schemas.openxmlformats.org/drawingml/2006/picture">
-                <pic:pic>
-                  <pic:nvPicPr>
-                    <pic:cNvPr id="0" name="hw1-blog-source-queries.jpg"/>
-                    <pic:cNvPicPr/>
-                  </pic:nvPicPr>
-                  <pic:blipFill>
-                    <a:blip r:embed="rId18"/>
-                    <a:stretch>
-                      <a:fillRect/>
-                    </a:stretch>
-                  </pic:blipFill>
-                  <pic:spPr>
-                    <a:xfrm>
-                      <a:off x="0" y="0"/>
-                      <a:ext cx="4722482" cy="5029200"/>
-                    </a:xfrm>
-                    <a:prstGeom prst="rect"/>
-                    <a:ln w="6350">
-                      <a:solidFill>
-                        <a:srgbClr val="666666"/>
-                      </a:solidFill>
-                    </a:ln>
                   </pic:spPr>
                 </pic:pic>
               </a:graphicData>
@@ -884,26 +570,22 @@
     </w:p>
     <w:p>
       <w:pPr>
-        <w:pStyle w:val="Heading3"/>
+        <w:spacing w:before="60" w:after="200"/>
+        <w:jc w:val="center"/>
       </w:pPr>
       <w:r>
         <w:rPr>
-          <w:rFonts w:ascii="Times New Roman" w:hAnsi="Times New Roman" w:eastAsia="Times New Roman" w:cs="Times New Roman"/>
-          <w:spacing w:val="0"/>
-          <w:w w:val="100"/>
-          <w:position w:val="0"/>
-          <w:sz w:val="20"/>
-          <w:szCs w:val="20"/>
-          <w:i w:val="0"/>
-          <w:iCs w:val="0"/>
+          <w:rFonts w:ascii="Segoe UI" w:hAnsi="Segoe UI"/>
+          <w:i/>
+          <w:color w:val="64748B"/>
+          <w:sz w:val="19"/>
         </w:rPr>
-        <w:t>MongoDB result</w:t>
+        <w:t>Figure 1.8: MongoDB Compass (mongosh) - Query 1 &amp; Query 2 Results Verification</w:t>
       </w:r>
     </w:p>
     <w:p>
       <w:pPr>
-        <w:keepLines/>
-        <w:spacing w:after="120"/>
+        <w:spacing w:before="80" w:after="40"/>
         <w:jc w:val="center"/>
       </w:pPr>
       <w:r>
@@ -922,7 +604,7 @@
                     <pic:cNvPicPr/>
                   </pic:nvPicPr>
                   <pic:blipFill>
-                    <a:blip r:embed="rId19"/>
+                    <a:blip r:embed="rId17"/>
                     <a:stretch>
                       <a:fillRect/>
                     </a:stretch>
@@ -933,11 +615,6 @@
                       <a:ext cx="6217920" cy="3342132"/>
                     </a:xfrm>
                     <a:prstGeom prst="rect"/>
-                    <a:ln w="6350">
-                      <a:solidFill>
-                        <a:srgbClr val="666666"/>
-                      </a:solidFill>
-                    </a:ln>
                   </pic:spPr>
                 </pic:pic>
               </a:graphicData>
@@ -947,92 +624,84 @@
       </w:r>
     </w:p>
     <w:p>
+      <w:pPr>
+        <w:spacing w:before="60" w:after="200"/>
+        <w:jc w:val="center"/>
+      </w:pPr>
       <w:r>
-        <w:br w:type="page"/>
+        <w:rPr>
+          <w:rFonts w:ascii="Segoe UI" w:hAnsi="Segoe UI"/>
+          <w:i/>
+          <w:color w:val="64748B"/>
+          <w:sz w:val="19"/>
+        </w:rPr>
+        <w:t>Figure 1.9: MongoDB Compass (mongosh) - Post Update ($push, $inc) &amp; Category Aggregation Results</w:t>
       </w:r>
     </w:p>
     <w:p>
       <w:pPr>
-        <w:pStyle w:val="Heading1"/>
+        <w:spacing w:before="320" w:after="120"/>
       </w:pPr>
       <w:r>
         <w:rPr>
-          <w:rFonts w:ascii="Times New Roman" w:hAnsi="Times New Roman" w:eastAsia="Times New Roman" w:cs="Times New Roman"/>
-          <w:spacing w:val="0"/>
-          <w:w w:val="100"/>
-          <w:position w:val="0"/>
-          <w:sz w:val="28"/>
-          <w:szCs w:val="28"/>
-          <w:i w:val="0"/>
-          <w:iCs w:val="0"/>
+          <w:rFonts w:ascii="Segoe UI" w:hAnsi="Segoe UI"/>
+          <w:b/>
+          <w:color w:val="1E3A8A"/>
+          <w:sz w:val="30"/>
         </w:rPr>
-        <w:t>Lab 1 - Homework 3: Cloud Deployment to Render.com</w:t>
+        <w:t>PART 2: LAB 1B - HOMEWORK ASSIGNMENTS</w:t>
       </w:r>
     </w:p>
     <w:p>
       <w:pPr>
-        <w:pStyle w:val="Heading2"/>
+        <w:spacing w:before="240" w:after="80"/>
       </w:pPr>
       <w:r>
         <w:rPr>
-          <w:rFonts w:ascii="Times New Roman" w:hAnsi="Times New Roman" w:eastAsia="Times New Roman" w:cs="Times New Roman"/>
-          <w:spacing w:val="0"/>
-          <w:w w:val="100"/>
-          <w:position w:val="0"/>
-          <w:sz w:val="24"/>
-          <w:szCs w:val="24"/>
-          <w:i w:val="0"/>
-          <w:iCs w:val="0"/>
+          <w:rFonts w:ascii="Segoe UI" w:hAnsi="Segoe UI"/>
+          <w:b/>
+          <w:color w:val="111827"/>
+          <w:sz w:val="25"/>
         </w:rPr>
-        <w:t>Express Server &amp; Greeting API Configuration</w:t>
+        <w:t>2.1. Homework 1: Managing Order Transactions with SQL Transaction Integrity</w:t>
       </w:r>
     </w:p>
     <w:p>
       <w:pPr>
-        <w:spacing w:after="160"/>
+        <w:spacing w:after="120"/>
       </w:pPr>
       <w:r>
         <w:rPr>
-          <w:rFonts w:ascii="Times New Roman" w:hAnsi="Times New Roman" w:eastAsia="Times New Roman" w:cs="Times New Roman"/>
-          <w:spacing w:val="0"/>
-          <w:w w:val="100"/>
-          <w:position w:val="0"/>
-          <w:sz w:val="22"/>
-          <w:szCs w:val="22"/>
-          <w:i w:val="0"/>
-          <w:iCs w:val="0"/>
+          <w:rFonts w:ascii="Segoe UI" w:hAnsi="Segoe UI"/>
+          <w:color w:val="334155"/>
+          <w:sz w:val="20"/>
         </w:rPr>
-        <w:t>Cấu hình máy chủ ứng dụng Node.js/Express với endpoint RESTful /api/greeting trả về cấu trúc JSON chứa đầy đủ siêu dữ liệu sinh viên, lớp học và thông số môi trường máy chủ. Tích hợp middleware xử lý body và CORS phục vụ môi trường Cloud.</w:t>
+        <w:t>Requirements: Create 'store_transaction_db' with 4 tables: customers, products, orders, order_items.</w:t>
+        <w:br/>
+        <w:t>Implement a strict 5-step order transaction workflow in Node.js (homework_sql_transaction.js):</w:t>
+        <w:br/>
+        <w:t>1. Step 1: Validate customer balance &gt;= total AND product stock &gt;= quantity.</w:t>
+        <w:br/>
+        <w:t>2. Step 2: Deduct amount from customer balance (UPDATE customers SET balance = balance - total).</w:t>
+        <w:br/>
+        <w:t>3. Step 3: Deduct quantity from product stock (UPDATE products SET stock = stock - quantity).</w:t>
+        <w:br/>
+        <w:t>4. Step 4: Insert record into orders table.</w:t>
+        <w:br/>
+        <w:t>5. Step 5: Insert line item into order_items table.</w:t>
+        <w:br/>
+        <w:t>Commit transaction on success, or trigger rollback on error (insufficient balance or stock).</w:t>
       </w:r>
     </w:p>
     <w:p>
       <w:pPr>
-        <w:pStyle w:val="Heading3"/>
-      </w:pPr>
-      <w:r>
-        <w:rPr>
-          <w:rFonts w:ascii="Times New Roman" w:hAnsi="Times New Roman" w:eastAsia="Times New Roman" w:cs="Times New Roman"/>
-          <w:spacing w:val="0"/>
-          <w:w w:val="100"/>
-          <w:position w:val="0"/>
-          <w:sz w:val="20"/>
-          <w:szCs w:val="20"/>
-          <w:i w:val="0"/>
-          <w:iCs w:val="0"/>
-        </w:rPr>
-        <w:t>Source code</w:t>
-      </w:r>
-    </w:p>
-    <w:p>
-      <w:pPr>
-        <w:keepLines/>
-        <w:spacing w:after="120"/>
+        <w:spacing w:before="80" w:after="40"/>
         <w:jc w:val="center"/>
       </w:pPr>
       <w:r>
         <w:drawing>
           <wp:inline xmlns:a="http://schemas.openxmlformats.org/drawingml/2006/main" xmlns:pic="http://schemas.openxmlformats.org/drawingml/2006/picture">
-            <wp:extent cx="4722482" cy="5029200"/>
+            <wp:extent cx="6217920" cy="6621764"/>
             <wp:docPr id="10" name="Picture 10"/>
             <wp:cNvGraphicFramePr>
               <a:graphicFrameLocks noChangeAspect="1"/>
@@ -1041,7 +710,117 @@
               <a:graphicData uri="http://schemas.openxmlformats.org/drawingml/2006/picture">
                 <pic:pic>
                   <pic:nvPicPr>
-                    <pic:cNvPr id="0" name="hw1-render-source.jpg"/>
+                    <pic:cNvPr id="0" name="hw2-trans-source-setup.jpg"/>
+                    <pic:cNvPicPr/>
+                  </pic:nvPicPr>
+                  <pic:blipFill>
+                    <a:blip r:embed="rId18"/>
+                    <a:stretch>
+                      <a:fillRect/>
+                    </a:stretch>
+                  </pic:blipFill>
+                  <pic:spPr>
+                    <a:xfrm>
+                      <a:off x="0" y="0"/>
+                      <a:ext cx="6217920" cy="6621764"/>
+                    </a:xfrm>
+                    <a:prstGeom prst="rect"/>
+                  </pic:spPr>
+                </pic:pic>
+              </a:graphicData>
+            </a:graphic>
+          </wp:inline>
+        </w:drawing>
+      </w:r>
+    </w:p>
+    <w:p>
+      <w:pPr>
+        <w:spacing w:before="60" w:after="200"/>
+        <w:jc w:val="center"/>
+      </w:pPr>
+      <w:r>
+        <w:rPr>
+          <w:rFonts w:ascii="Segoe UI" w:hAnsi="Segoe UI"/>
+          <w:i/>
+          <w:color w:val="64748B"/>
+          <w:sz w:val="19"/>
+        </w:rPr>
+        <w:t>Figure 2.1: MySQL Transaction Schema &amp; Connection Pool Setup in VS Code</w:t>
+      </w:r>
+    </w:p>
+    <w:p>
+      <w:pPr>
+        <w:spacing w:before="80" w:after="40"/>
+        <w:jc w:val="center"/>
+      </w:pPr>
+      <w:r>
+        <w:drawing>
+          <wp:inline xmlns:a="http://schemas.openxmlformats.org/drawingml/2006/main" xmlns:pic="http://schemas.openxmlformats.org/drawingml/2006/picture">
+            <wp:extent cx="6217920" cy="6621764"/>
+            <wp:docPr id="11" name="Picture 11"/>
+            <wp:cNvGraphicFramePr>
+              <a:graphicFrameLocks noChangeAspect="1"/>
+            </wp:cNvGraphicFramePr>
+            <a:graphic>
+              <a:graphicData uri="http://schemas.openxmlformats.org/drawingml/2006/picture">
+                <pic:pic>
+                  <pic:nvPicPr>
+                    <pic:cNvPr id="0" name="hw2-trans-source-workflow.jpg"/>
+                    <pic:cNvPicPr/>
+                  </pic:nvPicPr>
+                  <pic:blipFill>
+                    <a:blip r:embed="rId19"/>
+                    <a:stretch>
+                      <a:fillRect/>
+                    </a:stretch>
+                  </pic:blipFill>
+                  <pic:spPr>
+                    <a:xfrm>
+                      <a:off x="0" y="0"/>
+                      <a:ext cx="6217920" cy="6621764"/>
+                    </a:xfrm>
+                    <a:prstGeom prst="rect"/>
+                  </pic:spPr>
+                </pic:pic>
+              </a:graphicData>
+            </a:graphic>
+          </wp:inline>
+        </w:drawing>
+      </w:r>
+    </w:p>
+    <w:p>
+      <w:pPr>
+        <w:spacing w:before="60" w:after="200"/>
+        <w:jc w:val="center"/>
+      </w:pPr>
+      <w:r>
+        <w:rPr>
+          <w:rFonts w:ascii="Segoe UI" w:hAnsi="Segoe UI"/>
+          <w:i/>
+          <w:color w:val="64748B"/>
+          <w:sz w:val="19"/>
+        </w:rPr>
+        <w:t>Figure 2.2: 5-Step Order Transaction Logic with Commit and Rollback Safeguards</w:t>
+      </w:r>
+    </w:p>
+    <w:p>
+      <w:pPr>
+        <w:spacing w:before="80" w:after="40"/>
+        <w:jc w:val="center"/>
+      </w:pPr>
+      <w:r>
+        <w:drawing>
+          <wp:inline xmlns:a="http://schemas.openxmlformats.org/drawingml/2006/main" xmlns:pic="http://schemas.openxmlformats.org/drawingml/2006/picture">
+            <wp:extent cx="6217920" cy="6621764"/>
+            <wp:docPr id="12" name="Picture 12"/>
+            <wp:cNvGraphicFramePr>
+              <a:graphicFrameLocks noChangeAspect="1"/>
+            </wp:cNvGraphicFramePr>
+            <a:graphic>
+              <a:graphicData uri="http://schemas.openxmlformats.org/drawingml/2006/picture">
+                <pic:pic>
+                  <pic:nvPicPr>
+                    <pic:cNvPr id="0" name="hw2-trans-terminal.jpg"/>
                     <pic:cNvPicPr/>
                   </pic:nvPicPr>
                   <pic:blipFill>
@@ -1053,14 +832,9 @@
                   <pic:spPr>
                     <a:xfrm>
                       <a:off x="0" y="0"/>
-                      <a:ext cx="4722482" cy="5029200"/>
+                      <a:ext cx="6217920" cy="6621764"/>
                     </a:xfrm>
                     <a:prstGeom prst="rect"/>
-                    <a:ln w="6350">
-                      <a:solidFill>
-                        <a:srgbClr val="666666"/>
-                      </a:solidFill>
-                    </a:ln>
                   </pic:spPr>
                 </pic:pic>
               </a:graphicData>
@@ -1071,33 +845,29 @@
     </w:p>
     <w:p>
       <w:pPr>
-        <w:pStyle w:val="Heading3"/>
+        <w:spacing w:before="60" w:after="200"/>
+        <w:jc w:val="center"/>
       </w:pPr>
       <w:r>
         <w:rPr>
-          <w:rFonts w:ascii="Times New Roman" w:hAnsi="Times New Roman" w:eastAsia="Times New Roman" w:cs="Times New Roman"/>
-          <w:spacing w:val="0"/>
-          <w:w w:val="100"/>
-          <w:position w:val="0"/>
-          <w:sz w:val="20"/>
-          <w:szCs w:val="20"/>
-          <w:i w:val="0"/>
-          <w:iCs w:val="0"/>
+          <w:rFonts w:ascii="Segoe UI" w:hAnsi="Segoe UI"/>
+          <w:i/>
+          <w:color w:val="64748B"/>
+          <w:sz w:val="19"/>
         </w:rPr>
-        <w:t>Terminal output</w:t>
+        <w:t>Figure 2.3: Terminal Execution Output - Successful Commit and Rollback Verification</w:t>
       </w:r>
     </w:p>
     <w:p>
       <w:pPr>
-        <w:keepLines/>
-        <w:spacing w:after="120"/>
+        <w:spacing w:before="80" w:after="40"/>
         <w:jc w:val="center"/>
       </w:pPr>
       <w:r>
         <w:drawing>
           <wp:inline xmlns:a="http://schemas.openxmlformats.org/drawingml/2006/main" xmlns:pic="http://schemas.openxmlformats.org/drawingml/2006/picture">
-            <wp:extent cx="4722482" cy="5029200"/>
-            <wp:docPr id="11" name="Picture 11"/>
+            <wp:extent cx="6217920" cy="4681790"/>
+            <wp:docPr id="13" name="Picture 13"/>
             <wp:cNvGraphicFramePr>
               <a:graphicFrameLocks noChangeAspect="1"/>
             </wp:cNvGraphicFramePr>
@@ -1105,7 +875,7 @@
               <a:graphicData uri="http://schemas.openxmlformats.org/drawingml/2006/picture">
                 <pic:pic>
                   <pic:nvPicPr>
-                    <pic:cNvPr id="0" name="hw1-render-terminal.jpg"/>
+                    <pic:cNvPr id="0" name="hw2-trans-workbench.jpg"/>
                     <pic:cNvPicPr/>
                   </pic:nvPicPr>
                   <pic:blipFill>
@@ -1117,14 +887,9 @@
                   <pic:spPr>
                     <a:xfrm>
                       <a:off x="0" y="0"/>
-                      <a:ext cx="4722482" cy="5029200"/>
+                      <a:ext cx="6217920" cy="4681790"/>
                     </a:xfrm>
                     <a:prstGeom prst="rect"/>
-                    <a:ln w="6350">
-                      <a:solidFill>
-                        <a:srgbClr val="666666"/>
-                      </a:solidFill>
-                    </a:ln>
                   </pic:spPr>
                 </pic:pic>
               </a:graphicData>
@@ -1134,93 +899,65 @@
       </w:r>
     </w:p>
     <w:p>
+      <w:pPr>
+        <w:spacing w:before="60" w:after="200"/>
+        <w:jc w:val="center"/>
+      </w:pPr>
       <w:r>
-        <w:br w:type="page"/>
+        <w:rPr>
+          <w:rFonts w:ascii="Segoe UI" w:hAnsi="Segoe UI"/>
+          <w:i/>
+          <w:color w:val="64748B"/>
+          <w:sz w:val="19"/>
+        </w:rPr>
+        <w:t>Figure 2.4: MySQL Workbench - Committed Order &amp; Order Items Verification in Result Grid</w:t>
       </w:r>
     </w:p>
     <w:p>
       <w:pPr>
-        <w:pStyle w:val="Heading1"/>
+        <w:spacing w:before="240" w:after="80"/>
       </w:pPr>
       <w:r>
         <w:rPr>
-          <w:rFonts w:ascii="Times New Roman" w:hAnsi="Times New Roman" w:eastAsia="Times New Roman" w:cs="Times New Roman"/>
-          <w:spacing w:val="0"/>
-          <w:w w:val="100"/>
-          <w:position w:val="0"/>
-          <w:sz w:val="28"/>
-          <w:szCs w:val="28"/>
-          <w:i w:val="0"/>
-          <w:iCs w:val="0"/>
+          <w:rFonts w:ascii="Segoe UI" w:hAnsi="Segoe UI"/>
+          <w:b/>
+          <w:color w:val="111827"/>
+          <w:sz w:val="25"/>
         </w:rPr>
-        <w:t>Lab 1 - Homework 3: Cloud Deployment to Render.com</w:t>
+        <w:t>2.2. Homework 2: Designing a Mongoose Schema for Course Registration (Student &amp; Course)</w:t>
       </w:r>
     </w:p>
     <w:p>
       <w:pPr>
-        <w:pStyle w:val="Heading2"/>
+        <w:spacing w:after="120"/>
       </w:pPr>
       <w:r>
         <w:rPr>
-          <w:rFonts w:ascii="Times New Roman" w:hAnsi="Times New Roman" w:eastAsia="Times New Roman" w:cs="Times New Roman"/>
-          <w:spacing w:val="0"/>
-          <w:w w:val="100"/>
-          <w:position w:val="0"/>
-          <w:sz w:val="24"/>
-          <w:szCs w:val="24"/>
-          <w:i w:val="0"/>
-          <w:iCs w:val="0"/>
+          <w:rFonts w:ascii="Segoe UI" w:hAnsi="Segoe UI"/>
+          <w:color w:val="334155"/>
+          <w:sz w:val="20"/>
         </w:rPr>
-        <w:t>Live Production Deployment &amp; Verification on Render.com</w:t>
+        <w:t>Requirements: Define Many-to-Many relationship using Mongoose ODM in homework_many_to_many.js:</w:t>
+        <w:br/>
+        <w:t>• Student Schema: courses [{ type: Schema.Types.ObjectId, ref: 'Course' }]</w:t>
+        <w:br/>
+        <w:t>• Course Schema: students [{ type: Schema.Types.ObjectId, ref: 'Student' }], maxStudents, availableSlots</w:t>
+        <w:br/>
+        <w:t>• enrollCourse(studentId, courseId): Validate non-duplicate and availableSlots &gt; 0. Add cross-references and decrease availableSlots by 1.</w:t>
+        <w:br/>
+        <w:t>• dropCourse(studentId, courseId): Remove cross-references from both models and restore availableSlots by 1.</w:t>
       </w:r>
     </w:p>
     <w:p>
       <w:pPr>
-        <w:spacing w:after="160"/>
-      </w:pPr>
-      <w:r>
-        <w:rPr>
-          <w:rFonts w:ascii="Times New Roman" w:hAnsi="Times New Roman" w:eastAsia="Times New Roman" w:cs="Times New Roman"/>
-          <w:spacing w:val="0"/>
-          <w:w w:val="100"/>
-          <w:position w:val="0"/>
-          <w:sz w:val="22"/>
-          <w:szCs w:val="22"/>
-          <w:i w:val="0"/>
-          <w:iCs w:val="0"/>
-        </w:rPr>
-        <w:t>Triển khai ứng dụng tự động qua pipeline CI/CD tích hợp giữa GitHub và Render.com Web Service. Endpoint thực tế phản hồi mã trạng thái HTTP 200 OK trên môi trường Internet toàn cầu với độ trễ tối ưu.</w:t>
-      </w:r>
-    </w:p>
-    <w:p>
-      <w:pPr>
-        <w:pStyle w:val="Heading3"/>
-      </w:pPr>
-      <w:r>
-        <w:rPr>
-          <w:rFonts w:ascii="Times New Roman" w:hAnsi="Times New Roman" w:eastAsia="Times New Roman" w:cs="Times New Roman"/>
-          <w:spacing w:val="0"/>
-          <w:w w:val="100"/>
-          <w:position w:val="0"/>
-          <w:sz w:val="20"/>
-          <w:szCs w:val="20"/>
-          <w:i w:val="0"/>
-          <w:iCs w:val="0"/>
-        </w:rPr>
-        <w:t>Browser result</w:t>
-      </w:r>
-    </w:p>
-    <w:p>
-      <w:pPr>
-        <w:keepLines/>
-        <w:spacing w:after="120"/>
+        <w:spacing w:before="80" w:after="40"/>
         <w:jc w:val="center"/>
       </w:pPr>
       <w:r>
         <w:drawing>
           <wp:inline xmlns:a="http://schemas.openxmlformats.org/drawingml/2006/main" xmlns:pic="http://schemas.openxmlformats.org/drawingml/2006/picture">
-            <wp:extent cx="6217920" cy="3224337"/>
-            <wp:docPr id="12" name="Picture 12"/>
+            <wp:extent cx="6217920" cy="6621764"/>
+            <wp:docPr id="14" name="Picture 14"/>
             <wp:cNvGraphicFramePr>
               <a:graphicFrameLocks noChangeAspect="1"/>
             </wp:cNvGraphicFramePr>
@@ -1228,7 +965,7 @@
               <a:graphicData uri="http://schemas.openxmlformats.org/drawingml/2006/picture">
                 <pic:pic>
                   <pic:nvPicPr>
-                    <pic:cNvPr id="0" name="hw1-render-browser.jpg"/>
+                    <pic:cNvPr id="0" name="hw2-m2m-source-schemas.jpg"/>
                     <pic:cNvPicPr/>
                   </pic:nvPicPr>
                   <pic:blipFill>
@@ -1240,14 +977,9 @@
                   <pic:spPr>
                     <a:xfrm>
                       <a:off x="0" y="0"/>
-                      <a:ext cx="6217920" cy="3224337"/>
+                      <a:ext cx="6217920" cy="6621764"/>
                     </a:xfrm>
                     <a:prstGeom prst="rect"/>
-                    <a:ln w="6350">
-                      <a:solidFill>
-                        <a:srgbClr val="666666"/>
-                      </a:solidFill>
-                    </a:ln>
                   </pic:spPr>
                 </pic:pic>
               </a:graphicData>
@@ -1257,93 +989,30 @@
       </w:r>
     </w:p>
     <w:p>
+      <w:pPr>
+        <w:spacing w:before="60" w:after="200"/>
+        <w:jc w:val="center"/>
+      </w:pPr>
       <w:r>
-        <w:br w:type="page"/>
+        <w:rPr>
+          <w:rFonts w:ascii="Segoe UI" w:hAnsi="Segoe UI"/>
+          <w:i/>
+          <w:color w:val="64748B"/>
+          <w:sz w:val="19"/>
+        </w:rPr>
+        <w:t>Figure 2.5: Mongoose Student and Course Schemas with Model Cross-References</w:t>
       </w:r>
     </w:p>
     <w:p>
       <w:pPr>
-        <w:pStyle w:val="Heading1"/>
-      </w:pPr>
-      <w:r>
-        <w:rPr>
-          <w:rFonts w:ascii="Times New Roman" w:hAnsi="Times New Roman" w:eastAsia="Times New Roman" w:cs="Times New Roman"/>
-          <w:spacing w:val="0"/>
-          <w:w w:val="100"/>
-          <w:position w:val="0"/>
-          <w:sz w:val="28"/>
-          <w:szCs w:val="28"/>
-          <w:i w:val="0"/>
-          <w:iCs w:val="0"/>
-        </w:rPr>
-        <w:t>Lab 1b - Homework 1: SQL Order Transaction Integrity</w:t>
-      </w:r>
-    </w:p>
-    <w:p>
-      <w:pPr>
-        <w:pStyle w:val="Heading2"/>
-      </w:pPr>
-      <w:r>
-        <w:rPr>
-          <w:rFonts w:ascii="Times New Roman" w:hAnsi="Times New Roman" w:eastAsia="Times New Roman" w:cs="Times New Roman"/>
-          <w:spacing w:val="0"/>
-          <w:w w:val="100"/>
-          <w:position w:val="0"/>
-          <w:sz w:val="24"/>
-          <w:szCs w:val="24"/>
-          <w:i w:val="0"/>
-          <w:iCs w:val="0"/>
-        </w:rPr>
-        <w:t>Database Schema &amp; Seed Data Initialization</w:t>
-      </w:r>
-    </w:p>
-    <w:p>
-      <w:pPr>
-        <w:spacing w:after="160"/>
-      </w:pPr>
-      <w:r>
-        <w:rPr>
-          <w:rFonts w:ascii="Times New Roman" w:hAnsi="Times New Roman" w:eastAsia="Times New Roman" w:cs="Times New Roman"/>
-          <w:spacing w:val="0"/>
-          <w:w w:val="100"/>
-          <w:position w:val="0"/>
-          <w:sz w:val="22"/>
-          <w:szCs w:val="22"/>
-          <w:i w:val="0"/>
-          <w:iCs w:val="0"/>
-        </w:rPr>
-        <w:t>Xây dựng cơ sở dữ liệu bán hàng store_transaction_db gồm 4 bảng customers, products, orders, order_items trên storage engine InnoDB của MySQL. Cơ chế Transaction được áp dụng nhằm thực thi trọn vẹn 4 nguyên lý ACID.</w:t>
-      </w:r>
-    </w:p>
-    <w:p>
-      <w:pPr>
-        <w:pStyle w:val="Heading3"/>
-      </w:pPr>
-      <w:r>
-        <w:rPr>
-          <w:rFonts w:ascii="Times New Roman" w:hAnsi="Times New Roman" w:eastAsia="Times New Roman" w:cs="Times New Roman"/>
-          <w:spacing w:val="0"/>
-          <w:w w:val="100"/>
-          <w:position w:val="0"/>
-          <w:sz w:val="20"/>
-          <w:szCs w:val="20"/>
-          <w:i w:val="0"/>
-          <w:iCs w:val="0"/>
-        </w:rPr>
-        <w:t>Source code</w:t>
-      </w:r>
-    </w:p>
-    <w:p>
-      <w:pPr>
-        <w:keepLines/>
-        <w:spacing w:after="120"/>
+        <w:spacing w:before="80" w:after="40"/>
         <w:jc w:val="center"/>
       </w:pPr>
       <w:r>
         <w:drawing>
           <wp:inline xmlns:a="http://schemas.openxmlformats.org/drawingml/2006/main" xmlns:pic="http://schemas.openxmlformats.org/drawingml/2006/picture">
-            <wp:extent cx="4722482" cy="5029200"/>
-            <wp:docPr id="13" name="Picture 13"/>
+            <wp:extent cx="6217920" cy="6621764"/>
+            <wp:docPr id="15" name="Picture 15"/>
             <wp:cNvGraphicFramePr>
               <a:graphicFrameLocks noChangeAspect="1"/>
             </wp:cNvGraphicFramePr>
@@ -1351,7 +1020,7 @@
               <a:graphicData uri="http://schemas.openxmlformats.org/drawingml/2006/picture">
                 <pic:pic>
                   <pic:nvPicPr>
-                    <pic:cNvPr id="0" name="hw2-trans-source-setup.jpg"/>
+                    <pic:cNvPr id="0" name="hw2-m2m-source-methods.jpg"/>
                     <pic:cNvPicPr/>
                   </pic:nvPicPr>
                   <pic:blipFill>
@@ -1363,14 +1032,9 @@
                   <pic:spPr>
                     <a:xfrm>
                       <a:off x="0" y="0"/>
-                      <a:ext cx="4722482" cy="5029200"/>
+                      <a:ext cx="6217920" cy="6621764"/>
                     </a:xfrm>
                     <a:prstGeom prst="rect"/>
-                    <a:ln w="6350">
-                      <a:solidFill>
-                        <a:srgbClr val="666666"/>
-                      </a:solidFill>
-                    </a:ln>
                   </pic:spPr>
                 </pic:pic>
               </a:graphicData>
@@ -1380,93 +1044,30 @@
       </w:r>
     </w:p>
     <w:p>
+      <w:pPr>
+        <w:spacing w:before="60" w:after="200"/>
+        <w:jc w:val="center"/>
+      </w:pPr>
       <w:r>
-        <w:br w:type="page"/>
+        <w:rPr>
+          <w:rFonts w:ascii="Segoe UI" w:hAnsi="Segoe UI"/>
+          <w:i/>
+          <w:color w:val="64748B"/>
+          <w:sz w:val="19"/>
+        </w:rPr>
+        <w:t>Figure 2.6: enrollCourse() and dropCourse() Business Logic with Capacity Enforcement</w:t>
       </w:r>
     </w:p>
     <w:p>
       <w:pPr>
-        <w:pStyle w:val="Heading1"/>
-      </w:pPr>
-      <w:r>
-        <w:rPr>
-          <w:rFonts w:ascii="Times New Roman" w:hAnsi="Times New Roman" w:eastAsia="Times New Roman" w:cs="Times New Roman"/>
-          <w:spacing w:val="0"/>
-          <w:w w:val="100"/>
-          <w:position w:val="0"/>
-          <w:sz w:val="28"/>
-          <w:szCs w:val="28"/>
-          <w:i w:val="0"/>
-          <w:iCs w:val="0"/>
-        </w:rPr>
-        <w:t>Lab 1b - Homework 1: SQL Order Transaction Integrity</w:t>
-      </w:r>
-    </w:p>
-    <w:p>
-      <w:pPr>
-        <w:pStyle w:val="Heading2"/>
-      </w:pPr>
-      <w:r>
-        <w:rPr>
-          <w:rFonts w:ascii="Times New Roman" w:hAnsi="Times New Roman" w:eastAsia="Times New Roman" w:cs="Times New Roman"/>
-          <w:spacing w:val="0"/>
-          <w:w w:val="100"/>
-          <w:position w:val="0"/>
-          <w:sz w:val="24"/>
-          <w:szCs w:val="24"/>
-          <w:i w:val="0"/>
-          <w:iCs w:val="0"/>
-        </w:rPr>
-        <w:t>Strict 5-Step Order Transaction Workflow</w:t>
-      </w:r>
-    </w:p>
-    <w:p>
-      <w:pPr>
-        <w:spacing w:after="160"/>
-      </w:pPr>
-      <w:r>
-        <w:rPr>
-          <w:rFonts w:ascii="Times New Roman" w:hAnsi="Times New Roman" w:eastAsia="Times New Roman" w:cs="Times New Roman"/>
-          <w:spacing w:val="0"/>
-          <w:w w:val="100"/>
-          <w:position w:val="0"/>
-          <w:sz w:val="22"/>
-          <w:szCs w:val="22"/>
-          <w:i w:val="0"/>
-          <w:iCs w:val="0"/>
-        </w:rPr>
-        <w:t>Quy trình xử lý giao dịch 5 bước nghiêm ngặt: (1) Kiểm tra tính khả dụng số dư và tồn kho; (2) Khấu trừ số dư ví người dùng; (3) Giảm trừ số lượng tồn kho sản phẩm; (4) Khởi tạo đơn hàng; (5) Ghi nhận chi tiết từng sản phẩm. Toàn bộ chuỗi thao tác được bảo vệ trong khối try-catch với lệnh beginTransaction(), commit() và rollback().</w:t>
-      </w:r>
-    </w:p>
-    <w:p>
-      <w:pPr>
-        <w:pStyle w:val="Heading3"/>
-      </w:pPr>
-      <w:r>
-        <w:rPr>
-          <w:rFonts w:ascii="Times New Roman" w:hAnsi="Times New Roman" w:eastAsia="Times New Roman" w:cs="Times New Roman"/>
-          <w:spacing w:val="0"/>
-          <w:w w:val="100"/>
-          <w:position w:val="0"/>
-          <w:sz w:val="20"/>
-          <w:szCs w:val="20"/>
-          <w:i w:val="0"/>
-          <w:iCs w:val="0"/>
-        </w:rPr>
-        <w:t>Source code</w:t>
-      </w:r>
-    </w:p>
-    <w:p>
-      <w:pPr>
-        <w:keepLines/>
-        <w:spacing w:after="120"/>
+        <w:spacing w:before="80" w:after="40"/>
         <w:jc w:val="center"/>
       </w:pPr>
       <w:r>
         <w:drawing>
           <wp:inline xmlns:a="http://schemas.openxmlformats.org/drawingml/2006/main" xmlns:pic="http://schemas.openxmlformats.org/drawingml/2006/picture">
-            <wp:extent cx="4722482" cy="5029200"/>
-            <wp:docPr id="14" name="Picture 14"/>
+            <wp:extent cx="6217920" cy="6621764"/>
+            <wp:docPr id="16" name="Picture 16"/>
             <wp:cNvGraphicFramePr>
               <a:graphicFrameLocks noChangeAspect="1"/>
             </wp:cNvGraphicFramePr>
@@ -1474,7 +1075,7 @@
               <a:graphicData uri="http://schemas.openxmlformats.org/drawingml/2006/picture">
                 <pic:pic>
                   <pic:nvPicPr>
-                    <pic:cNvPr id="0" name="hw2-trans-source-workflow.jpg"/>
+                    <pic:cNvPr id="0" name="hw2-m2m-terminal.jpg"/>
                     <pic:cNvPicPr/>
                   </pic:nvPicPr>
                   <pic:blipFill>
@@ -1486,14 +1087,9 @@
                   <pic:spPr>
                     <a:xfrm>
                       <a:off x="0" y="0"/>
-                      <a:ext cx="4722482" cy="5029200"/>
+                      <a:ext cx="6217920" cy="6621764"/>
                     </a:xfrm>
                     <a:prstGeom prst="rect"/>
-                    <a:ln w="6350">
-                      <a:solidFill>
-                        <a:srgbClr val="666666"/>
-                      </a:solidFill>
-                    </a:ln>
                   </pic:spPr>
                 </pic:pic>
               </a:graphicData>
@@ -1504,33 +1100,29 @@
     </w:p>
     <w:p>
       <w:pPr>
-        <w:pStyle w:val="Heading3"/>
+        <w:spacing w:before="60" w:after="200"/>
+        <w:jc w:val="center"/>
       </w:pPr>
       <w:r>
         <w:rPr>
-          <w:rFonts w:ascii="Times New Roman" w:hAnsi="Times New Roman" w:eastAsia="Times New Roman" w:cs="Times New Roman"/>
-          <w:spacing w:val="0"/>
-          <w:w w:val="100"/>
-          <w:position w:val="0"/>
-          <w:sz w:val="20"/>
-          <w:szCs w:val="20"/>
-          <w:i w:val="0"/>
-          <w:iCs w:val="0"/>
+          <w:rFonts w:ascii="Segoe UI" w:hAnsi="Segoe UI"/>
+          <w:i/>
+          <w:color w:val="64748B"/>
+          <w:sz w:val="19"/>
         </w:rPr>
-        <w:t>Terminal output</w:t>
+        <w:t>Figure 2.7: Terminal Test Suite Execution Output - Enrollment, Duplicate Check, Drop, and Population</w:t>
       </w:r>
     </w:p>
     <w:p>
       <w:pPr>
-        <w:keepLines/>
-        <w:spacing w:after="120"/>
+        <w:spacing w:before="80" w:after="40"/>
         <w:jc w:val="center"/>
       </w:pPr>
       <w:r>
         <w:drawing>
           <wp:inline xmlns:a="http://schemas.openxmlformats.org/drawingml/2006/main" xmlns:pic="http://schemas.openxmlformats.org/drawingml/2006/picture">
-            <wp:extent cx="4722482" cy="5029200"/>
-            <wp:docPr id="15" name="Picture 15"/>
+            <wp:extent cx="6217920" cy="3342132"/>
+            <wp:docPr id="17" name="Picture 17"/>
             <wp:cNvGraphicFramePr>
               <a:graphicFrameLocks noChangeAspect="1"/>
             </wp:cNvGraphicFramePr>
@@ -1538,7 +1130,7 @@
               <a:graphicData uri="http://schemas.openxmlformats.org/drawingml/2006/picture">
                 <pic:pic>
                   <pic:nvPicPr>
-                    <pic:cNvPr id="0" name="hw2-trans-terminal.jpg"/>
+                    <pic:cNvPr id="0" name="hw2-m2m-compass.jpg"/>
                     <pic:cNvPicPr/>
                   </pic:nvPicPr>
                   <pic:blipFill>
@@ -1550,383 +1142,9 @@
                   <pic:spPr>
                     <a:xfrm>
                       <a:off x="0" y="0"/>
-                      <a:ext cx="4722482" cy="5029200"/>
+                      <a:ext cx="6217920" cy="3342132"/>
                     </a:xfrm>
                     <a:prstGeom prst="rect"/>
-                    <a:ln w="6350">
-                      <a:solidFill>
-                        <a:srgbClr val="666666"/>
-                      </a:solidFill>
-                    </a:ln>
-                  </pic:spPr>
-                </pic:pic>
-              </a:graphicData>
-            </a:graphic>
-          </wp:inline>
-        </w:drawing>
-      </w:r>
-    </w:p>
-    <w:p>
-      <w:r>
-        <w:br w:type="page"/>
-      </w:r>
-    </w:p>
-    <w:p>
-      <w:pPr>
-        <w:pStyle w:val="Heading1"/>
-      </w:pPr>
-      <w:r>
-        <w:rPr>
-          <w:rFonts w:ascii="Times New Roman" w:hAnsi="Times New Roman" w:eastAsia="Times New Roman" w:cs="Times New Roman"/>
-          <w:spacing w:val="0"/>
-          <w:w w:val="100"/>
-          <w:position w:val="0"/>
-          <w:sz w:val="28"/>
-          <w:szCs w:val="28"/>
-          <w:i w:val="0"/>
-          <w:iCs w:val="0"/>
-        </w:rPr>
-        <w:t>Lab 1b - Homework 1: SQL Order Transaction Integrity</w:t>
-      </w:r>
-    </w:p>
-    <w:p>
-      <w:pPr>
-        <w:pStyle w:val="Heading2"/>
-      </w:pPr>
-      <w:r>
-        <w:rPr>
-          <w:rFonts w:ascii="Times New Roman" w:hAnsi="Times New Roman" w:eastAsia="Times New Roman" w:cs="Times New Roman"/>
-          <w:spacing w:val="0"/>
-          <w:w w:val="100"/>
-          <w:position w:val="0"/>
-          <w:sz w:val="24"/>
-          <w:szCs w:val="24"/>
-          <w:i w:val="0"/>
-          <w:iCs w:val="0"/>
-        </w:rPr>
-        <w:t>Transaction Verification in MySQL Workbench</w:t>
-      </w:r>
-    </w:p>
-    <w:p>
-      <w:pPr>
-        <w:spacing w:after="160"/>
-      </w:pPr>
-      <w:r>
-        <w:rPr>
-          <w:rFonts w:ascii="Times New Roman" w:hAnsi="Times New Roman" w:eastAsia="Times New Roman" w:cs="Times New Roman"/>
-          <w:spacing w:val="0"/>
-          <w:w w:val="100"/>
-          <w:position w:val="0"/>
-          <w:sz w:val="22"/>
-          <w:szCs w:val="22"/>
-          <w:i w:val="0"/>
-          <w:iCs w:val="0"/>
-        </w:rPr>
-        <w:t>Kiểm chứng tính toàn vẹn dữ liệu: Trường hợp 1 thực hiện Commit thành công đơn hàng 40.000.000 VND; Trường hợp 2 và 3 tự động kích hoạt Rollback khi phát hiện số dư không đủ hoặc hết hàng tồn kho, bảo đảm không xảy ra mất mát dữ liệu.</w:t>
-      </w:r>
-    </w:p>
-    <w:p>
-      <w:pPr>
-        <w:pStyle w:val="Heading3"/>
-      </w:pPr>
-      <w:r>
-        <w:rPr>
-          <w:rFonts w:ascii="Times New Roman" w:hAnsi="Times New Roman" w:eastAsia="Times New Roman" w:cs="Times New Roman"/>
-          <w:spacing w:val="0"/>
-          <w:w w:val="100"/>
-          <w:position w:val="0"/>
-          <w:sz w:val="20"/>
-          <w:szCs w:val="20"/>
-          <w:i w:val="0"/>
-          <w:iCs w:val="0"/>
-        </w:rPr>
-        <w:t>MySQL Workbench result</w:t>
-      </w:r>
-    </w:p>
-    <w:p>
-      <w:pPr>
-        <w:keepLines/>
-        <w:spacing w:after="120"/>
-        <w:jc w:val="center"/>
-      </w:pPr>
-      <w:r>
-        <w:drawing>
-          <wp:inline xmlns:a="http://schemas.openxmlformats.org/drawingml/2006/main" xmlns:pic="http://schemas.openxmlformats.org/drawingml/2006/picture">
-            <wp:extent cx="6217920" cy="4681789"/>
-            <wp:docPr id="16" name="Picture 16"/>
-            <wp:cNvGraphicFramePr>
-              <a:graphicFrameLocks noChangeAspect="1"/>
-            </wp:cNvGraphicFramePr>
-            <a:graphic>
-              <a:graphicData uri="http://schemas.openxmlformats.org/drawingml/2006/picture">
-                <pic:pic>
-                  <pic:nvPicPr>
-                    <pic:cNvPr id="0" name="hw2-trans-workbench.jpg"/>
-                    <pic:cNvPicPr/>
-                  </pic:nvPicPr>
-                  <pic:blipFill>
-                    <a:blip r:embed="rId26"/>
-                    <a:stretch>
-                      <a:fillRect/>
-                    </a:stretch>
-                  </pic:blipFill>
-                  <pic:spPr>
-                    <a:xfrm>
-                      <a:off x="0" y="0"/>
-                      <a:ext cx="6217920" cy="4681789"/>
-                    </a:xfrm>
-                    <a:prstGeom prst="rect"/>
-                    <a:ln w="6350">
-                      <a:solidFill>
-                        <a:srgbClr val="666666"/>
-                      </a:solidFill>
-                    </a:ln>
-                  </pic:spPr>
-                </pic:pic>
-              </a:graphicData>
-            </a:graphic>
-          </wp:inline>
-        </w:drawing>
-      </w:r>
-    </w:p>
-    <w:p>
-      <w:r>
-        <w:br w:type="page"/>
-      </w:r>
-    </w:p>
-    <w:p>
-      <w:pPr>
-        <w:pStyle w:val="Heading1"/>
-      </w:pPr>
-      <w:r>
-        <w:rPr>
-          <w:rFonts w:ascii="Times New Roman" w:hAnsi="Times New Roman" w:eastAsia="Times New Roman" w:cs="Times New Roman"/>
-          <w:spacing w:val="0"/>
-          <w:w w:val="100"/>
-          <w:position w:val="0"/>
-          <w:sz w:val="28"/>
-          <w:szCs w:val="28"/>
-          <w:i w:val="0"/>
-          <w:iCs w:val="0"/>
-        </w:rPr>
-        <w:t>Lab 1b - Homework 2: Mongoose Many-to-Many Course Registration</w:t>
-      </w:r>
-    </w:p>
-    <w:p>
-      <w:pPr>
-        <w:pStyle w:val="Heading2"/>
-      </w:pPr>
-      <w:r>
-        <w:rPr>
-          <w:rFonts w:ascii="Times New Roman" w:hAnsi="Times New Roman" w:eastAsia="Times New Roman" w:cs="Times New Roman"/>
-          <w:spacing w:val="0"/>
-          <w:w w:val="100"/>
-          <w:position w:val="0"/>
-          <w:sz w:val="24"/>
-          <w:szCs w:val="24"/>
-          <w:i w:val="0"/>
-          <w:iCs w:val="0"/>
-        </w:rPr>
-        <w:t>Student &amp; Course Schemas with Model References</w:t>
-      </w:r>
-    </w:p>
-    <w:p>
-      <w:pPr>
-        <w:spacing w:after="160"/>
-      </w:pPr>
-      <w:r>
-        <w:rPr>
-          <w:rFonts w:ascii="Times New Roman" w:hAnsi="Times New Roman" w:eastAsia="Times New Roman" w:cs="Times New Roman"/>
-          <w:spacing w:val="0"/>
-          <w:w w:val="100"/>
-          <w:position w:val="0"/>
-          <w:sz w:val="22"/>
-          <w:szCs w:val="22"/>
-          <w:i w:val="0"/>
-          <w:iCs w:val="0"/>
-        </w:rPr>
-        <w:t>Thiết lập quan hệ nhiều-nhiều (Many-to-Many) hai chiều giữa Student và Course thông qua mảng chứa các tham chiếu ObjectId. Schema Course tích hợp sẵn các thuộc tính maxStudents và availableSlots phục vụ kiểm soát sức chứa lớp học.</w:t>
-      </w:r>
-    </w:p>
-    <w:p>
-      <w:pPr>
-        <w:pStyle w:val="Heading3"/>
-      </w:pPr>
-      <w:r>
-        <w:rPr>
-          <w:rFonts w:ascii="Times New Roman" w:hAnsi="Times New Roman" w:eastAsia="Times New Roman" w:cs="Times New Roman"/>
-          <w:spacing w:val="0"/>
-          <w:w w:val="100"/>
-          <w:position w:val="0"/>
-          <w:sz w:val="20"/>
-          <w:szCs w:val="20"/>
-          <w:i w:val="0"/>
-          <w:iCs w:val="0"/>
-        </w:rPr>
-        <w:t>Source code</w:t>
-      </w:r>
-    </w:p>
-    <w:p>
-      <w:pPr>
-        <w:keepLines/>
-        <w:spacing w:after="120"/>
-        <w:jc w:val="center"/>
-      </w:pPr>
-      <w:r>
-        <w:drawing>
-          <wp:inline xmlns:a="http://schemas.openxmlformats.org/drawingml/2006/main" xmlns:pic="http://schemas.openxmlformats.org/drawingml/2006/picture">
-            <wp:extent cx="4722482" cy="5029200"/>
-            <wp:docPr id="17" name="Picture 17"/>
-            <wp:cNvGraphicFramePr>
-              <a:graphicFrameLocks noChangeAspect="1"/>
-            </wp:cNvGraphicFramePr>
-            <a:graphic>
-              <a:graphicData uri="http://schemas.openxmlformats.org/drawingml/2006/picture">
-                <pic:pic>
-                  <pic:nvPicPr>
-                    <pic:cNvPr id="0" name="hw2-m2m-source-schemas.jpg"/>
-                    <pic:cNvPicPr/>
-                  </pic:nvPicPr>
-                  <pic:blipFill>
-                    <a:blip r:embed="rId27"/>
-                    <a:stretch>
-                      <a:fillRect/>
-                    </a:stretch>
-                  </pic:blipFill>
-                  <pic:spPr>
-                    <a:xfrm>
-                      <a:off x="0" y="0"/>
-                      <a:ext cx="4722482" cy="5029200"/>
-                    </a:xfrm>
-                    <a:prstGeom prst="rect"/>
-                    <a:ln w="6350">
-                      <a:solidFill>
-                        <a:srgbClr val="666666"/>
-                      </a:solidFill>
-                    </a:ln>
-                  </pic:spPr>
-                </pic:pic>
-              </a:graphicData>
-            </a:graphic>
-          </wp:inline>
-        </w:drawing>
-      </w:r>
-    </w:p>
-    <w:p>
-      <w:r>
-        <w:br w:type="page"/>
-      </w:r>
-    </w:p>
-    <w:p>
-      <w:pPr>
-        <w:pStyle w:val="Heading1"/>
-      </w:pPr>
-      <w:r>
-        <w:rPr>
-          <w:rFonts w:ascii="Times New Roman" w:hAnsi="Times New Roman" w:eastAsia="Times New Roman" w:cs="Times New Roman"/>
-          <w:spacing w:val="0"/>
-          <w:w w:val="100"/>
-          <w:position w:val="0"/>
-          <w:sz w:val="28"/>
-          <w:szCs w:val="28"/>
-          <w:i w:val="0"/>
-          <w:iCs w:val="0"/>
-        </w:rPr>
-        <w:t>Lab 1b - Homework 2: Mongoose Many-to-Many Course Registration</w:t>
-      </w:r>
-    </w:p>
-    <w:p>
-      <w:pPr>
-        <w:pStyle w:val="Heading2"/>
-      </w:pPr>
-      <w:r>
-        <w:rPr>
-          <w:rFonts w:ascii="Times New Roman" w:hAnsi="Times New Roman" w:eastAsia="Times New Roman" w:cs="Times New Roman"/>
-          <w:spacing w:val="0"/>
-          <w:w w:val="100"/>
-          <w:position w:val="0"/>
-          <w:sz w:val="24"/>
-          <w:szCs w:val="24"/>
-          <w:i w:val="0"/>
-          <w:iCs w:val="0"/>
-        </w:rPr>
-        <w:t>Enrollment &amp; Drop Course Logic with Capacity Enforcement</w:t>
-      </w:r>
-    </w:p>
-    <w:p>
-      <w:pPr>
-        <w:spacing w:after="160"/>
-      </w:pPr>
-      <w:r>
-        <w:rPr>
-          <w:rFonts w:ascii="Times New Roman" w:hAnsi="Times New Roman" w:eastAsia="Times New Roman" w:cs="Times New Roman"/>
-          <w:spacing w:val="0"/>
-          <w:w w:val="100"/>
-          <w:position w:val="0"/>
-          <w:sz w:val="22"/>
-          <w:szCs w:val="22"/>
-          <w:i w:val="0"/>
-          <w:iCs w:val="0"/>
-        </w:rPr>
-        <w:t>Triển khai hàm enrollCourse và dropCourse kiểm soát tính nhất quán: Chặn ghi danh trùng lặp, chặn khi hết chỗ trống (availableSlots = 0), tự động hoàn trả slot và cập nhật đồng bộ cả 2 collection khi hủy môn học.</w:t>
-      </w:r>
-    </w:p>
-    <w:p>
-      <w:pPr>
-        <w:pStyle w:val="Heading3"/>
-      </w:pPr>
-      <w:r>
-        <w:rPr>
-          <w:rFonts w:ascii="Times New Roman" w:hAnsi="Times New Roman" w:eastAsia="Times New Roman" w:cs="Times New Roman"/>
-          <w:spacing w:val="0"/>
-          <w:w w:val="100"/>
-          <w:position w:val="0"/>
-          <w:sz w:val="20"/>
-          <w:szCs w:val="20"/>
-          <w:i w:val="0"/>
-          <w:iCs w:val="0"/>
-        </w:rPr>
-        <w:t>Source code</w:t>
-      </w:r>
-    </w:p>
-    <w:p>
-      <w:pPr>
-        <w:keepLines/>
-        <w:spacing w:after="120"/>
-        <w:jc w:val="center"/>
-      </w:pPr>
-      <w:r>
-        <w:drawing>
-          <wp:inline xmlns:a="http://schemas.openxmlformats.org/drawingml/2006/main" xmlns:pic="http://schemas.openxmlformats.org/drawingml/2006/picture">
-            <wp:extent cx="4722482" cy="5029200"/>
-            <wp:docPr id="18" name="Picture 18"/>
-            <wp:cNvGraphicFramePr>
-              <a:graphicFrameLocks noChangeAspect="1"/>
-            </wp:cNvGraphicFramePr>
-            <a:graphic>
-              <a:graphicData uri="http://schemas.openxmlformats.org/drawingml/2006/picture">
-                <pic:pic>
-                  <pic:nvPicPr>
-                    <pic:cNvPr id="0" name="hw2-m2m-source-methods.jpg"/>
-                    <pic:cNvPicPr/>
-                  </pic:nvPicPr>
-                  <pic:blipFill>
-                    <a:blip r:embed="rId28"/>
-                    <a:stretch>
-                      <a:fillRect/>
-                    </a:stretch>
-                  </pic:blipFill>
-                  <pic:spPr>
-                    <a:xfrm>
-                      <a:off x="0" y="0"/>
-                      <a:ext cx="4722482" cy="5029200"/>
-                    </a:xfrm>
-                    <a:prstGeom prst="rect"/>
-                    <a:ln w="6350">
-                      <a:solidFill>
-                        <a:srgbClr val="666666"/>
-                      </a:solidFill>
-                    </a:ln>
                   </pic:spPr>
                 </pic:pic>
               </a:graphicData>
@@ -1937,645 +1155,27 @@
     </w:p>
     <w:p>
       <w:pPr>
-        <w:pStyle w:val="Heading3"/>
+        <w:spacing w:before="60" w:after="200"/>
+        <w:jc w:val="center"/>
       </w:pPr>
       <w:r>
         <w:rPr>
-          <w:rFonts w:ascii="Times New Roman" w:hAnsi="Times New Roman" w:eastAsia="Times New Roman" w:cs="Times New Roman"/>
-          <w:spacing w:val="0"/>
-          <w:w w:val="100"/>
-          <w:position w:val="0"/>
-          <w:sz w:val="20"/>
-          <w:szCs w:val="20"/>
-          <w:i w:val="0"/>
-          <w:iCs w:val="0"/>
+          <w:rFonts w:ascii="Segoe UI" w:hAnsi="Segoe UI"/>
+          <w:i/>
+          <w:color w:val="64748B"/>
+          <w:sz w:val="19"/>
         </w:rPr>
-        <w:t>Terminal output</w:t>
-      </w:r>
-    </w:p>
-    <w:p>
-      <w:pPr>
-        <w:keepLines/>
-        <w:spacing w:after="120"/>
-        <w:jc w:val="center"/>
-      </w:pPr>
-      <w:r>
-        <w:drawing>
-          <wp:inline xmlns:a="http://schemas.openxmlformats.org/drawingml/2006/main" xmlns:pic="http://schemas.openxmlformats.org/drawingml/2006/picture">
-            <wp:extent cx="4722482" cy="5029200"/>
-            <wp:docPr id="19" name="Picture 19"/>
-            <wp:cNvGraphicFramePr>
-              <a:graphicFrameLocks noChangeAspect="1"/>
-            </wp:cNvGraphicFramePr>
-            <a:graphic>
-              <a:graphicData uri="http://schemas.openxmlformats.org/drawingml/2006/picture">
-                <pic:pic>
-                  <pic:nvPicPr>
-                    <pic:cNvPr id="0" name="hw2-m2m-terminal.jpg"/>
-                    <pic:cNvPicPr/>
-                  </pic:nvPicPr>
-                  <pic:blipFill>
-                    <a:blip r:embed="rId29"/>
-                    <a:stretch>
-                      <a:fillRect/>
-                    </a:stretch>
-                  </pic:blipFill>
-                  <pic:spPr>
-                    <a:xfrm>
-                      <a:off x="0" y="0"/>
-                      <a:ext cx="4722482" cy="5029200"/>
-                    </a:xfrm>
-                    <a:prstGeom prst="rect"/>
-                    <a:ln w="6350">
-                      <a:solidFill>
-                        <a:srgbClr val="666666"/>
-                      </a:solidFill>
-                    </a:ln>
-                  </pic:spPr>
-                </pic:pic>
-              </a:graphicData>
-            </a:graphic>
-          </wp:inline>
-        </w:drawing>
-      </w:r>
-    </w:p>
-    <w:p>
-      <w:r>
-        <w:br w:type="page"/>
-      </w:r>
-    </w:p>
-    <w:p>
-      <w:pPr>
-        <w:pStyle w:val="Heading1"/>
-      </w:pPr>
-      <w:r>
-        <w:rPr>
-          <w:rFonts w:ascii="Times New Roman" w:hAnsi="Times New Roman" w:eastAsia="Times New Roman" w:cs="Times New Roman"/>
-          <w:spacing w:val="0"/>
-          <w:w w:val="100"/>
-          <w:position w:val="0"/>
-          <w:sz w:val="28"/>
-          <w:szCs w:val="28"/>
-          <w:i w:val="0"/>
-          <w:iCs w:val="0"/>
-        </w:rPr>
-        <w:t>Lab 1b - Homework 2: Mongoose Many-to-Many Course Registration</w:t>
-      </w:r>
-    </w:p>
-    <w:p>
-      <w:pPr>
-        <w:pStyle w:val="Heading2"/>
-      </w:pPr>
-      <w:r>
-        <w:rPr>
-          <w:rFonts w:ascii="Times New Roman" w:hAnsi="Times New Roman" w:eastAsia="Times New Roman" w:cs="Times New Roman"/>
-          <w:spacing w:val="0"/>
-          <w:w w:val="100"/>
-          <w:position w:val="0"/>
-          <w:sz w:val="24"/>
-          <w:szCs w:val="24"/>
-          <w:i w:val="0"/>
-          <w:iCs w:val="0"/>
-        </w:rPr>
-        <w:t>Relationship Population and MongoDB Verification</w:t>
-      </w:r>
-    </w:p>
-    <w:p>
-      <w:pPr>
-        <w:spacing w:after="160"/>
-      </w:pPr>
-      <w:r>
-        <w:rPr>
-          <w:rFonts w:ascii="Times New Roman" w:hAnsi="Times New Roman" w:eastAsia="Times New Roman" w:cs="Times New Roman"/>
-          <w:spacing w:val="0"/>
-          <w:w w:val="100"/>
-          <w:position w:val="0"/>
-          <w:sz w:val="22"/>
-          <w:szCs w:val="22"/>
-          <w:i w:val="0"/>
-          <w:iCs w:val="0"/>
-        </w:rPr>
-        <w:t>Sử dụng phương thức populate() để đối soát dữ liệu liên kết thực tế trên MongoDB, bảo đảm sinh viên truy xuất được đầy đủ thông tin các khóa học đã ghi danh và ngược lại danh sách lớp học hiển thị đúng sinh viên tham gia.</w:t>
-      </w:r>
-    </w:p>
-    <w:p>
-      <w:pPr>
-        <w:pStyle w:val="Heading3"/>
-      </w:pPr>
-      <w:r>
-        <w:rPr>
-          <w:rFonts w:ascii="Times New Roman" w:hAnsi="Times New Roman" w:eastAsia="Times New Roman" w:cs="Times New Roman"/>
-          <w:spacing w:val="0"/>
-          <w:w w:val="100"/>
-          <w:position w:val="0"/>
-          <w:sz w:val="20"/>
-          <w:szCs w:val="20"/>
-          <w:i w:val="0"/>
-          <w:iCs w:val="0"/>
-        </w:rPr>
-        <w:t>MongoDB result</w:t>
-      </w:r>
-    </w:p>
-    <w:p>
-      <w:pPr>
-        <w:keepLines/>
-        <w:spacing w:after="120"/>
-        <w:jc w:val="center"/>
-      </w:pPr>
-      <w:r>
-        <w:drawing>
-          <wp:inline xmlns:a="http://schemas.openxmlformats.org/drawingml/2006/main" xmlns:pic="http://schemas.openxmlformats.org/drawingml/2006/picture">
-            <wp:extent cx="6217920" cy="3342132"/>
-            <wp:docPr id="20" name="Picture 20"/>
-            <wp:cNvGraphicFramePr>
-              <a:graphicFrameLocks noChangeAspect="1"/>
-            </wp:cNvGraphicFramePr>
-            <a:graphic>
-              <a:graphicData uri="http://schemas.openxmlformats.org/drawingml/2006/picture">
-                <pic:pic>
-                  <pic:nvPicPr>
-                    <pic:cNvPr id="0" name="hw2-m2m-compass.jpg"/>
-                    <pic:cNvPicPr/>
-                  </pic:nvPicPr>
-                  <pic:blipFill>
-                    <a:blip r:embed="rId30"/>
-                    <a:stretch>
-                      <a:fillRect/>
-                    </a:stretch>
-                  </pic:blipFill>
-                  <pic:spPr>
-                    <a:xfrm>
-                      <a:off x="0" y="0"/>
-                      <a:ext cx="6217920" cy="3342132"/>
-                    </a:xfrm>
-                    <a:prstGeom prst="rect"/>
-                    <a:ln w="6350">
-                      <a:solidFill>
-                        <a:srgbClr val="666666"/>
-                      </a:solidFill>
-                    </a:ln>
-                  </pic:spPr>
-                </pic:pic>
-              </a:graphicData>
-            </a:graphic>
-          </wp:inline>
-        </w:drawing>
-      </w:r>
-    </w:p>
-    <w:p>
-      <w:r>
-        <w:br w:type="page"/>
-      </w:r>
-    </w:p>
-    <w:p>
-      <w:pPr>
-        <w:pStyle w:val="Heading1"/>
-      </w:pPr>
-      <w:r>
-        <w:rPr>
-          <w:rFonts w:ascii="Times New Roman" w:hAnsi="Times New Roman" w:eastAsia="Times New Roman" w:cs="Times New Roman"/>
-          <w:spacing w:val="0"/>
-          <w:w w:val="100"/>
-          <w:position w:val="0"/>
-          <w:sz w:val="28"/>
-          <w:szCs w:val="28"/>
-          <w:i w:val="0"/>
-          <w:iCs w:val="0"/>
-        </w:rPr>
-        <w:t>Lab 1b - Homework 3: Invoices JSON Validation &amp; Sync into MongoDB</w:t>
-      </w:r>
-    </w:p>
-    <w:p>
-      <w:pPr>
-        <w:pStyle w:val="Heading2"/>
-      </w:pPr>
-      <w:r>
-        <w:rPr>
-          <w:rFonts w:ascii="Times New Roman" w:hAnsi="Times New Roman" w:eastAsia="Times New Roman" w:cs="Times New Roman"/>
-          <w:spacing w:val="0"/>
-          <w:w w:val="100"/>
-          <w:position w:val="0"/>
-          <w:sz w:val="24"/>
-          <w:szCs w:val="24"/>
-          <w:i w:val="0"/>
-          <w:iCs w:val="0"/>
-        </w:rPr>
-        <w:t>Invoice Schema with Data Validation Rules</w:t>
-      </w:r>
-    </w:p>
-    <w:p>
-      <w:pPr>
-        <w:spacing w:after="160"/>
-      </w:pPr>
-      <w:r>
-        <w:rPr>
-          <w:rFonts w:ascii="Times New Roman" w:hAnsi="Times New Roman" w:eastAsia="Times New Roman" w:cs="Times New Roman"/>
-          <w:spacing w:val="0"/>
-          <w:w w:val="100"/>
-          <w:position w:val="0"/>
-          <w:sz w:val="22"/>
-          <w:szCs w:val="22"/>
-          <w:i w:val="0"/>
-          <w:iCs w:val="0"/>
-        </w:rPr>
-        <w:t>Định nghĩa Invoice Schema trên Mongoose với các quy tắc ràng buộc nghiêm ngặt: Biểu thức chính quy (RegEx) kiểm tra email hợp lệ, kiểm tra mảng mặt hàng không được rỗng (length &gt; 0), danh mục thanh toán thuộc enum cho phép, và thuộc tính ảo virtual tính tổng tiền totalAmount.</w:t>
-      </w:r>
-    </w:p>
-    <w:p>
-      <w:pPr>
-        <w:pStyle w:val="Heading3"/>
-      </w:pPr>
-      <w:r>
-        <w:rPr>
-          <w:rFonts w:ascii="Times New Roman" w:hAnsi="Times New Roman" w:eastAsia="Times New Roman" w:cs="Times New Roman"/>
-          <w:spacing w:val="0"/>
-          <w:w w:val="100"/>
-          <w:position w:val="0"/>
-          <w:sz w:val="20"/>
-          <w:szCs w:val="20"/>
-          <w:i w:val="0"/>
-          <w:iCs w:val="0"/>
-        </w:rPr>
-        <w:t>Source code</w:t>
-      </w:r>
-    </w:p>
-    <w:p>
-      <w:pPr>
-        <w:keepLines/>
-        <w:spacing w:after="120"/>
-        <w:jc w:val="center"/>
-      </w:pPr>
-      <w:r>
-        <w:drawing>
-          <wp:inline xmlns:a="http://schemas.openxmlformats.org/drawingml/2006/main" xmlns:pic="http://schemas.openxmlformats.org/drawingml/2006/picture">
-            <wp:extent cx="4722482" cy="5029200"/>
-            <wp:docPr id="21" name="Picture 21"/>
-            <wp:cNvGraphicFramePr>
-              <a:graphicFrameLocks noChangeAspect="1"/>
-            </wp:cNvGraphicFramePr>
-            <a:graphic>
-              <a:graphicData uri="http://schemas.openxmlformats.org/drawingml/2006/picture">
-                <pic:pic>
-                  <pic:nvPicPr>
-                    <pic:cNvPr id="0" name="hw2-invoice-source-schema.jpg"/>
-                    <pic:cNvPicPr/>
-                  </pic:nvPicPr>
-                  <pic:blipFill>
-                    <a:blip r:embed="rId31"/>
-                    <a:stretch>
-                      <a:fillRect/>
-                    </a:stretch>
-                  </pic:blipFill>
-                  <pic:spPr>
-                    <a:xfrm>
-                      <a:off x="0" y="0"/>
-                      <a:ext cx="4722482" cy="5029200"/>
-                    </a:xfrm>
-                    <a:prstGeom prst="rect"/>
-                    <a:ln w="6350">
-                      <a:solidFill>
-                        <a:srgbClr val="666666"/>
-                      </a:solidFill>
-                    </a:ln>
-                  </pic:spPr>
-                </pic:pic>
-              </a:graphicData>
-            </a:graphic>
-          </wp:inline>
-        </w:drawing>
-      </w:r>
-    </w:p>
-    <w:p>
-      <w:r>
-        <w:br w:type="page"/>
-      </w:r>
-    </w:p>
-    <w:p>
-      <w:pPr>
-        <w:pStyle w:val="Heading1"/>
-      </w:pPr>
-      <w:r>
-        <w:rPr>
-          <w:rFonts w:ascii="Times New Roman" w:hAnsi="Times New Roman" w:eastAsia="Times New Roman" w:cs="Times New Roman"/>
-          <w:spacing w:val="0"/>
-          <w:w w:val="100"/>
-          <w:position w:val="0"/>
-          <w:sz w:val="28"/>
-          <w:szCs w:val="28"/>
-          <w:i w:val="0"/>
-          <w:iCs w:val="0"/>
-        </w:rPr>
-        <w:t>Lab 1b - Homework 3: Invoices JSON Validation &amp; Sync into MongoDB</w:t>
-      </w:r>
-    </w:p>
-    <w:p>
-      <w:pPr>
-        <w:pStyle w:val="Heading2"/>
-      </w:pPr>
-      <w:r>
-        <w:rPr>
-          <w:rFonts w:ascii="Times New Roman" w:hAnsi="Times New Roman" w:eastAsia="Times New Roman" w:cs="Times New Roman"/>
-          <w:spacing w:val="0"/>
-          <w:w w:val="100"/>
-          <w:position w:val="0"/>
-          <w:sz w:val="24"/>
-          <w:szCs w:val="24"/>
-          <w:i w:val="0"/>
-          <w:iCs w:val="0"/>
-        </w:rPr>
-        <w:t>Batch File Ingestion &amp; Error Case Handling</w:t>
-      </w:r>
-    </w:p>
-    <w:p>
-      <w:pPr>
-        <w:spacing w:after="160"/>
-      </w:pPr>
-      <w:r>
-        <w:rPr>
-          <w:rFonts w:ascii="Times New Roman" w:hAnsi="Times New Roman" w:eastAsia="Times New Roman" w:cs="Times New Roman"/>
-          <w:spacing w:val="0"/>
-          <w:w w:val="100"/>
-          <w:position w:val="0"/>
-          <w:sz w:val="22"/>
-          <w:szCs w:val="22"/>
-          <w:i w:val="0"/>
-          <w:iCs w:val="0"/>
-        </w:rPr>
-        <w:t>Đọc và phân tích file nguồn invoices.json qua fs.readFileSync, sau đó thực hiện đồng bộ hàng loạt vào MongoDB với cờ runValidators: true. Xây dựng 3 kịch bản kiểm thử ngoại lệ bắt chính xác lỗi email sai, giỏ hàng rỗng và phương thức thanh toán không hỗ trợ.</w:t>
-      </w:r>
-    </w:p>
-    <w:p>
-      <w:pPr>
-        <w:pStyle w:val="Heading3"/>
-      </w:pPr>
-      <w:r>
-        <w:rPr>
-          <w:rFonts w:ascii="Times New Roman" w:hAnsi="Times New Roman" w:eastAsia="Times New Roman" w:cs="Times New Roman"/>
-          <w:spacing w:val="0"/>
-          <w:w w:val="100"/>
-          <w:position w:val="0"/>
-          <w:sz w:val="20"/>
-          <w:szCs w:val="20"/>
-          <w:i w:val="0"/>
-          <w:iCs w:val="0"/>
-        </w:rPr>
-        <w:t>Source code</w:t>
-      </w:r>
-    </w:p>
-    <w:p>
-      <w:pPr>
-        <w:keepLines/>
-        <w:spacing w:after="120"/>
-        <w:jc w:val="center"/>
-      </w:pPr>
-      <w:r>
-        <w:drawing>
-          <wp:inline xmlns:a="http://schemas.openxmlformats.org/drawingml/2006/main" xmlns:pic="http://schemas.openxmlformats.org/drawingml/2006/picture">
-            <wp:extent cx="4722482" cy="5029200"/>
-            <wp:docPr id="22" name="Picture 22"/>
-            <wp:cNvGraphicFramePr>
-              <a:graphicFrameLocks noChangeAspect="1"/>
-            </wp:cNvGraphicFramePr>
-            <a:graphic>
-              <a:graphicData uri="http://schemas.openxmlformats.org/drawingml/2006/picture">
-                <pic:pic>
-                  <pic:nvPicPr>
-                    <pic:cNvPr id="0" name="hw2-invoice-source-sync.jpg"/>
-                    <pic:cNvPicPr/>
-                  </pic:nvPicPr>
-                  <pic:blipFill>
-                    <a:blip r:embed="rId32"/>
-                    <a:stretch>
-                      <a:fillRect/>
-                    </a:stretch>
-                  </pic:blipFill>
-                  <pic:spPr>
-                    <a:xfrm>
-                      <a:off x="0" y="0"/>
-                      <a:ext cx="4722482" cy="5029200"/>
-                    </a:xfrm>
-                    <a:prstGeom prst="rect"/>
-                    <a:ln w="6350">
-                      <a:solidFill>
-                        <a:srgbClr val="666666"/>
-                      </a:solidFill>
-                    </a:ln>
-                  </pic:spPr>
-                </pic:pic>
-              </a:graphicData>
-            </a:graphic>
-          </wp:inline>
-        </w:drawing>
-      </w:r>
-    </w:p>
-    <w:p>
-      <w:pPr>
-        <w:pStyle w:val="Heading3"/>
-      </w:pPr>
-      <w:r>
-        <w:rPr>
-          <w:rFonts w:ascii="Times New Roman" w:hAnsi="Times New Roman" w:eastAsia="Times New Roman" w:cs="Times New Roman"/>
-          <w:spacing w:val="0"/>
-          <w:w w:val="100"/>
-          <w:position w:val="0"/>
-          <w:sz w:val="20"/>
-          <w:szCs w:val="20"/>
-          <w:i w:val="0"/>
-          <w:iCs w:val="0"/>
-        </w:rPr>
-        <w:t>Terminal output</w:t>
-      </w:r>
-    </w:p>
-    <w:p>
-      <w:pPr>
-        <w:keepLines/>
-        <w:spacing w:after="120"/>
-        <w:jc w:val="center"/>
-      </w:pPr>
-      <w:r>
-        <w:drawing>
-          <wp:inline xmlns:a="http://schemas.openxmlformats.org/drawingml/2006/main" xmlns:pic="http://schemas.openxmlformats.org/drawingml/2006/picture">
-            <wp:extent cx="4722482" cy="5029200"/>
-            <wp:docPr id="23" name="Picture 23"/>
-            <wp:cNvGraphicFramePr>
-              <a:graphicFrameLocks noChangeAspect="1"/>
-            </wp:cNvGraphicFramePr>
-            <a:graphic>
-              <a:graphicData uri="http://schemas.openxmlformats.org/drawingml/2006/picture">
-                <pic:pic>
-                  <pic:nvPicPr>
-                    <pic:cNvPr id="0" name="hw2-invoice-terminal.jpg"/>
-                    <pic:cNvPicPr/>
-                  </pic:nvPicPr>
-                  <pic:blipFill>
-                    <a:blip r:embed="rId33"/>
-                    <a:stretch>
-                      <a:fillRect/>
-                    </a:stretch>
-                  </pic:blipFill>
-                  <pic:spPr>
-                    <a:xfrm>
-                      <a:off x="0" y="0"/>
-                      <a:ext cx="4722482" cy="5029200"/>
-                    </a:xfrm>
-                    <a:prstGeom prst="rect"/>
-                    <a:ln w="6350">
-                      <a:solidFill>
-                        <a:srgbClr val="666666"/>
-                      </a:solidFill>
-                    </a:ln>
-                  </pic:spPr>
-                </pic:pic>
-              </a:graphicData>
-            </a:graphic>
-          </wp:inline>
-        </w:drawing>
-      </w:r>
-    </w:p>
-    <w:p>
-      <w:r>
-        <w:br w:type="page"/>
-      </w:r>
-    </w:p>
-    <w:p>
-      <w:pPr>
-        <w:pStyle w:val="Heading1"/>
-      </w:pPr>
-      <w:r>
-        <w:rPr>
-          <w:rFonts w:ascii="Times New Roman" w:hAnsi="Times New Roman" w:eastAsia="Times New Roman" w:cs="Times New Roman"/>
-          <w:spacing w:val="0"/>
-          <w:w w:val="100"/>
-          <w:position w:val="0"/>
-          <w:sz w:val="28"/>
-          <w:szCs w:val="28"/>
-          <w:i w:val="0"/>
-          <w:iCs w:val="0"/>
-        </w:rPr>
-        <w:t>Lab 1b - Homework 3: Invoices JSON Validation &amp; Sync into MongoDB</w:t>
-      </w:r>
-    </w:p>
-    <w:p>
-      <w:pPr>
-        <w:pStyle w:val="Heading2"/>
-      </w:pPr>
-      <w:r>
-        <w:rPr>
-          <w:rFonts w:ascii="Times New Roman" w:hAnsi="Times New Roman" w:eastAsia="Times New Roman" w:cs="Times New Roman"/>
-          <w:spacing w:val="0"/>
-          <w:w w:val="100"/>
-          <w:position w:val="0"/>
-          <w:sz w:val="24"/>
-          <w:szCs w:val="24"/>
-          <w:i w:val="0"/>
-          <w:iCs w:val="0"/>
-        </w:rPr>
-        <w:t>Synchronized Invoices Stored in MongoDB</w:t>
-      </w:r>
-    </w:p>
-    <w:p>
-      <w:pPr>
-        <w:spacing w:after="160"/>
-      </w:pPr>
-      <w:r>
-        <w:rPr>
-          <w:rFonts w:ascii="Times New Roman" w:hAnsi="Times New Roman" w:eastAsia="Times New Roman" w:cs="Times New Roman"/>
-          <w:spacing w:val="0"/>
-          <w:w w:val="100"/>
-          <w:position w:val="0"/>
-          <w:sz w:val="22"/>
-          <w:szCs w:val="22"/>
-          <w:i w:val="0"/>
-          <w:iCs w:val="0"/>
-        </w:rPr>
-        <w:t>Đối soát thực tế 3 hóa đơn hợp lệ đã được lưu trữ an toàn trong collection invoices của MongoDB, tổng tiền hóa đơn được tính toán tự động qua getter và hiển thị đầy đủ trên giao diện Compass.</w:t>
-      </w:r>
-    </w:p>
-    <w:p>
-      <w:pPr>
-        <w:pStyle w:val="Heading3"/>
-      </w:pPr>
-      <w:r>
-        <w:rPr>
-          <w:rFonts w:ascii="Times New Roman" w:hAnsi="Times New Roman" w:eastAsia="Times New Roman" w:cs="Times New Roman"/>
-          <w:spacing w:val="0"/>
-          <w:w w:val="100"/>
-          <w:position w:val="0"/>
-          <w:sz w:val="20"/>
-          <w:szCs w:val="20"/>
-          <w:i w:val="0"/>
-          <w:iCs w:val="0"/>
-        </w:rPr>
-        <w:t>MongoDB result</w:t>
-      </w:r>
-    </w:p>
-    <w:p>
-      <w:pPr>
-        <w:keepLines/>
-        <w:spacing w:after="120"/>
-        <w:jc w:val="center"/>
-      </w:pPr>
-      <w:r>
-        <w:drawing>
-          <wp:inline xmlns:a="http://schemas.openxmlformats.org/drawingml/2006/main" xmlns:pic="http://schemas.openxmlformats.org/drawingml/2006/picture">
-            <wp:extent cx="6217920" cy="3342132"/>
-            <wp:docPr id="24" name="Picture 24"/>
-            <wp:cNvGraphicFramePr>
-              <a:graphicFrameLocks noChangeAspect="1"/>
-            </wp:cNvGraphicFramePr>
-            <a:graphic>
-              <a:graphicData uri="http://schemas.openxmlformats.org/drawingml/2006/picture">
-                <pic:pic>
-                  <pic:nvPicPr>
-                    <pic:cNvPr id="0" name="hw2-invoice-compass.jpg"/>
-                    <pic:cNvPicPr/>
-                  </pic:nvPicPr>
-                  <pic:blipFill>
-                    <a:blip r:embed="rId34"/>
-                    <a:stretch>
-                      <a:fillRect/>
-                    </a:stretch>
-                  </pic:blipFill>
-                  <pic:spPr>
-                    <a:xfrm>
-                      <a:off x="0" y="0"/>
-                      <a:ext cx="6217920" cy="3342132"/>
-                    </a:xfrm>
-                    <a:prstGeom prst="rect"/>
-                    <a:ln w="6350">
-                      <a:solidFill>
-                        <a:srgbClr val="666666"/>
-                      </a:solidFill>
-                    </a:ln>
-                  </pic:spPr>
-                </pic:pic>
-              </a:graphicData>
-            </a:graphic>
-          </wp:inline>
-        </w:drawing>
+        <w:t>Figure 2.8: MongoDB Compass - Synchronized Student and Course Relationship Documents in mongosh</w:t>
       </w:r>
     </w:p>
     <w:sectPr>
-      <w:footerReference w:type="default" r:id="rId9"/>
       <w:pgSz w:w="12240" w:h="15840"/>
-      <w:pgMar w:top="936" w:right="1080" w:bottom="936" w:left="1080" w:header="720" w:footer="432" w:gutter="0"/>
+      <w:pgMar w:top="1152" w:right="1152" w:bottom="1152" w:left="1152" w:header="720" w:footer="720" w:gutter="0"/>
       <w:cols w:space="720"/>
       <w:docGrid w:linePitch="360"/>
     </w:sectPr>
   </w:body>
 </w:document>
-</file>
-
-<file path=word/footer1.xml><?xml version="1.0" encoding="utf-8"?>
-<w:ftr xmlns:m="http://schemas.openxmlformats.org/officeDocument/2006/math" xmlns:mc="http://schemas.openxmlformats.org/markup-compatibility/2006" xmlns:mo="http://schemas.microsoft.com/office/mac/office/2008/main" xmlns:mv="urn:schemas-microsoft-com:mac:vml" xmlns:o="urn:schemas-microsoft-com:office:office" xmlns:r="http://schemas.openxmlformats.org/officeDocument/2006/relationships" xmlns:v="urn:schemas-microsoft-com:vml" xmlns:w10="urn:schemas-microsoft-com:office:word" xmlns:w14="http://schemas.microsoft.com/office/word/2010/wordml" xmlns:w="http://schemas.openxmlformats.org/wordprocessingml/2006/main" xmlns:wne="http://schemas.microsoft.com/office/word/2006/wordml" xmlns:wp14="http://schemas.microsoft.com/office/word/2010/wordprocessingDrawing" xmlns:wp="http://schemas.openxmlformats.org/drawingml/2006/wordprocessingDrawing" xmlns:wpc="http://schemas.microsoft.com/office/word/2010/wordprocessingCanvas" xmlns:wpg="http://schemas.microsoft.com/office/word/2010/wordprocessingGroup" xmlns:wpi="http://schemas.microsoft.com/office/word/2010/wordprocessingInk" xmlns:wps="http://schemas.microsoft.com/office/word/2010/wordprocessingShape" mc:Ignorable="w14 wp14">
-  <w:p>
-    <w:pPr>
-      <w:pStyle w:val="Footer"/>
-      <w:jc w:val="center"/>
-    </w:pPr>
-    <w:fldSimple w:instr="PAGE"/>
-  </w:p>
-</w:ftr>
 </file>
 
 <file path=word/numbering.xml><?xml version="1.0" encoding="utf-8"?>
@@ -2941,15 +1541,6 @@
     <w:name w:val="Normal"/>
     <w:qFormat/>
     <w:rsid w:val="00FC693F"/>
-    <w:pPr>
-      <w:spacing w:after="120" w:line="240" w:lineRule="auto"/>
-      <w:jc w:val="left"/>
-    </w:pPr>
-    <w:rPr>
-      <w:rFonts w:ascii="Times New Roman" w:hAnsi="Times New Roman"/>
-      <w:color w:val="000000"/>
-      <w:sz w:val="22"/>
-    </w:rPr>
   </w:style>
   <w:style w:type="paragraph" w:styleId="Header">
     <w:name w:val="header"/>
@@ -3006,15 +1597,14 @@
     <w:pPr>
       <w:keepNext/>
       <w:keepLines/>
-      <w:spacing w:before="140" w:after="120" w:line="240" w:lineRule="auto"/>
-      <w:jc w:val="left"/>
+      <w:spacing w:before="480" w:after="0"/>
       <w:outlineLvl w:val="0"/>
     </w:pPr>
     <w:rPr>
-      <w:rFonts w:asciiTheme="majorHAnsi" w:eastAsiaTheme="majorEastAsia" w:hAnsiTheme="majorHAnsi" w:cstheme="majorBidi" w:ascii="Times New Roman" w:hAnsi="Times New Roman"/>
+      <w:rFonts w:asciiTheme="majorHAnsi" w:eastAsiaTheme="majorEastAsia" w:hAnsiTheme="majorHAnsi" w:cstheme="majorBidi"/>
       <w:b/>
       <w:bCs/>
-      <w:color w:val="000000"/>
+      <w:color w:val="365F91" w:themeColor="accent1" w:themeShade="BF"/>
       <w:sz w:val="28"/>
       <w:szCs w:val="28"/>
     </w:rPr>
@@ -3031,16 +1621,15 @@
     <w:pPr>
       <w:keepNext/>
       <w:keepLines/>
-      <w:spacing w:before="140" w:after="120" w:line="240" w:lineRule="auto"/>
-      <w:jc w:val="left"/>
+      <w:spacing w:before="200" w:after="0"/>
       <w:outlineLvl w:val="1"/>
     </w:pPr>
     <w:rPr>
-      <w:rFonts w:asciiTheme="majorHAnsi" w:eastAsiaTheme="majorEastAsia" w:hAnsiTheme="majorHAnsi" w:cstheme="majorBidi" w:ascii="Times New Roman" w:hAnsi="Times New Roman"/>
+      <w:rFonts w:asciiTheme="majorHAnsi" w:eastAsiaTheme="majorEastAsia" w:hAnsiTheme="majorHAnsi" w:cstheme="majorBidi"/>
       <w:b/>
       <w:bCs/>
-      <w:color w:val="000000"/>
-      <w:sz w:val="24"/>
+      <w:color w:val="4F81BD" w:themeColor="accent1"/>
+      <w:sz w:val="26"/>
       <w:szCs w:val="26"/>
     </w:rPr>
   </w:style>
@@ -3056,16 +1645,14 @@
     <w:pPr>
       <w:keepNext/>
       <w:keepLines/>
-      <w:spacing w:before="140" w:after="120" w:line="240" w:lineRule="auto"/>
-      <w:jc w:val="left"/>
+      <w:spacing w:before="200" w:after="0"/>
       <w:outlineLvl w:val="2"/>
     </w:pPr>
     <w:rPr>
-      <w:rFonts w:asciiTheme="majorHAnsi" w:eastAsiaTheme="majorEastAsia" w:hAnsiTheme="majorHAnsi" w:cstheme="majorBidi" w:ascii="Times New Roman" w:hAnsi="Times New Roman"/>
+      <w:rFonts w:asciiTheme="majorHAnsi" w:eastAsiaTheme="majorEastAsia" w:hAnsiTheme="majorHAnsi" w:cstheme="majorBidi"/>
       <w:b/>
       <w:bCs/>
-      <w:color w:val="000000"/>
-      <w:sz w:val="20"/>
+      <w:color w:val="4F81BD" w:themeColor="accent1"/>
     </w:rPr>
   </w:style>
   <w:style w:type="paragraph" w:styleId="Heading4">
@@ -3299,16 +1886,15 @@
       <w:pBdr>
         <w:bottom w:val="single" w:sz="8" w:space="4" w:color="4F81BD" w:themeColor="accent1"/>
       </w:pBdr>
-      <w:spacing w:after="120" w:line="240" w:lineRule="auto"/>
+      <w:spacing w:after="300" w:line="240" w:lineRule="auto"/>
       <w:contextualSpacing/>
-      <w:jc w:val="left"/>
     </w:pPr>
     <w:rPr>
-      <w:rFonts w:asciiTheme="majorHAnsi" w:eastAsiaTheme="majorEastAsia" w:hAnsiTheme="majorHAnsi" w:cstheme="majorBidi" w:ascii="Times New Roman" w:hAnsi="Times New Roman"/>
-      <w:color w:val="000000"/>
+      <w:rFonts w:asciiTheme="majorHAnsi" w:eastAsiaTheme="majorEastAsia" w:hAnsiTheme="majorHAnsi" w:cstheme="majorBidi"/>
+      <w:color w:val="17365D" w:themeColor="text2" w:themeShade="BF"/>
       <w:spacing w:val="5"/>
       <w:kern w:val="28"/>
-      <w:sz w:val="38"/>
+      <w:sz w:val="52"/>
       <w:szCs w:val="52"/>
     </w:rPr>
   </w:style>
@@ -3339,16 +1925,14 @@
       <w:numPr>
         <w:ilvl w:val="1"/>
       </w:numPr>
-      <w:spacing w:after="120" w:line="240" w:lineRule="auto"/>
-      <w:jc w:val="left"/>
     </w:pPr>
     <w:rPr>
-      <w:rFonts w:asciiTheme="majorHAnsi" w:eastAsiaTheme="majorEastAsia" w:hAnsiTheme="majorHAnsi" w:cstheme="majorBidi" w:ascii="Times New Roman" w:hAnsi="Times New Roman"/>
+      <w:rFonts w:asciiTheme="majorHAnsi" w:eastAsiaTheme="majorEastAsia" w:hAnsiTheme="majorHAnsi" w:cstheme="majorBidi"/>
       <w:i/>
       <w:iCs/>
-      <w:color w:val="000000"/>
+      <w:color w:val="4F81BD" w:themeColor="accent1"/>
       <w:spacing w:val="15"/>
-      <w:sz w:val="22"/>
+      <w:sz w:val="24"/>
       <w:szCs w:val="24"/>
     </w:rPr>
   </w:style>

</xml_diff>

<commit_message>
fix(ui): resolve left margin overflow in VS Code editor and terminal screenshots
</commit_message>
<xml_diff>
--- a/Lab1_Lab1b_Homework_25560063_DoAnhTuan.docx
+++ b/Lab1_Lab1b_Homework_25560063_DoAnhTuan.docx
@@ -112,7 +112,7 @@
       <w:r>
         <w:drawing>
           <wp:inline xmlns:a="http://schemas.openxmlformats.org/drawingml/2006/main" xmlns:pic="http://schemas.openxmlformats.org/drawingml/2006/picture">
-            <wp:extent cx="6217920" cy="6621764"/>
+            <wp:extent cx="5852160" cy="6232249"/>
             <wp:docPr id="1" name="Picture 1"/>
             <wp:cNvGraphicFramePr>
               <a:graphicFrameLocks noChangeAspect="1"/>
@@ -133,7 +133,7 @@
                   <pic:spPr>
                     <a:xfrm>
                       <a:off x="0" y="0"/>
-                      <a:ext cx="6217920" cy="6621764"/>
+                      <a:ext cx="5852160" cy="6232249"/>
                     </a:xfrm>
                     <a:prstGeom prst="rect"/>
                   </pic:spPr>
@@ -167,7 +167,7 @@
       <w:r>
         <w:drawing>
           <wp:inline xmlns:a="http://schemas.openxmlformats.org/drawingml/2006/main" xmlns:pic="http://schemas.openxmlformats.org/drawingml/2006/picture">
-            <wp:extent cx="6217920" cy="6621764"/>
+            <wp:extent cx="5852160" cy="6232249"/>
             <wp:docPr id="2" name="Picture 2"/>
             <wp:cNvGraphicFramePr>
               <a:graphicFrameLocks noChangeAspect="1"/>
@@ -188,7 +188,7 @@
                   <pic:spPr>
                     <a:xfrm>
                       <a:off x="0" y="0"/>
-                      <a:ext cx="6217920" cy="6621764"/>
+                      <a:ext cx="5852160" cy="6232249"/>
                     </a:xfrm>
                     <a:prstGeom prst="rect"/>
                   </pic:spPr>
@@ -222,7 +222,7 @@
       <w:r>
         <w:drawing>
           <wp:inline xmlns:a="http://schemas.openxmlformats.org/drawingml/2006/main" xmlns:pic="http://schemas.openxmlformats.org/drawingml/2006/picture">
-            <wp:extent cx="6217920" cy="6621764"/>
+            <wp:extent cx="5852160" cy="6232249"/>
             <wp:docPr id="3" name="Picture 3"/>
             <wp:cNvGraphicFramePr>
               <a:graphicFrameLocks noChangeAspect="1"/>
@@ -243,7 +243,7 @@
                   <pic:spPr>
                     <a:xfrm>
                       <a:off x="0" y="0"/>
-                      <a:ext cx="6217920" cy="6621764"/>
+                      <a:ext cx="5852160" cy="6232249"/>
                     </a:xfrm>
                     <a:prstGeom prst="rect"/>
                   </pic:spPr>
@@ -277,7 +277,7 @@
       <w:r>
         <w:drawing>
           <wp:inline xmlns:a="http://schemas.openxmlformats.org/drawingml/2006/main" xmlns:pic="http://schemas.openxmlformats.org/drawingml/2006/picture">
-            <wp:extent cx="6217920" cy="4681790"/>
+            <wp:extent cx="5852160" cy="4406390"/>
             <wp:docPr id="4" name="Picture 4"/>
             <wp:cNvGraphicFramePr>
               <a:graphicFrameLocks noChangeAspect="1"/>
@@ -298,7 +298,7 @@
                   <pic:spPr>
                     <a:xfrm>
                       <a:off x="0" y="0"/>
-                      <a:ext cx="6217920" cy="4681790"/>
+                      <a:ext cx="5852160" cy="4406390"/>
                     </a:xfrm>
                     <a:prstGeom prst="rect"/>
                   </pic:spPr>
@@ -371,7 +371,7 @@
       <w:r>
         <w:drawing>
           <wp:inline xmlns:a="http://schemas.openxmlformats.org/drawingml/2006/main" xmlns:pic="http://schemas.openxmlformats.org/drawingml/2006/picture">
-            <wp:extent cx="6217920" cy="6621764"/>
+            <wp:extent cx="5852160" cy="6232249"/>
             <wp:docPr id="5" name="Picture 5"/>
             <wp:cNvGraphicFramePr>
               <a:graphicFrameLocks noChangeAspect="1"/>
@@ -392,7 +392,7 @@
                   <pic:spPr>
                     <a:xfrm>
                       <a:off x="0" y="0"/>
-                      <a:ext cx="6217920" cy="6621764"/>
+                      <a:ext cx="5852160" cy="6232249"/>
                     </a:xfrm>
                     <a:prstGeom prst="rect"/>
                   </pic:spPr>
@@ -426,7 +426,7 @@
       <w:r>
         <w:drawing>
           <wp:inline xmlns:a="http://schemas.openxmlformats.org/drawingml/2006/main" xmlns:pic="http://schemas.openxmlformats.org/drawingml/2006/picture">
-            <wp:extent cx="6217920" cy="6621764"/>
+            <wp:extent cx="5852160" cy="6232249"/>
             <wp:docPr id="6" name="Picture 6"/>
             <wp:cNvGraphicFramePr>
               <a:graphicFrameLocks noChangeAspect="1"/>
@@ -447,7 +447,7 @@
                   <pic:spPr>
                     <a:xfrm>
                       <a:off x="0" y="0"/>
-                      <a:ext cx="6217920" cy="6621764"/>
+                      <a:ext cx="5852160" cy="6232249"/>
                     </a:xfrm>
                     <a:prstGeom prst="rect"/>
                   </pic:spPr>
@@ -481,7 +481,7 @@
       <w:r>
         <w:drawing>
           <wp:inline xmlns:a="http://schemas.openxmlformats.org/drawingml/2006/main" xmlns:pic="http://schemas.openxmlformats.org/drawingml/2006/picture">
-            <wp:extent cx="6217920" cy="6621764"/>
+            <wp:extent cx="5852160" cy="6232249"/>
             <wp:docPr id="7" name="Picture 7"/>
             <wp:cNvGraphicFramePr>
               <a:graphicFrameLocks noChangeAspect="1"/>
@@ -502,7 +502,7 @@
                   <pic:spPr>
                     <a:xfrm>
                       <a:off x="0" y="0"/>
-                      <a:ext cx="6217920" cy="6621764"/>
+                      <a:ext cx="5852160" cy="6232249"/>
                     </a:xfrm>
                     <a:prstGeom prst="rect"/>
                   </pic:spPr>
@@ -536,7 +536,7 @@
       <w:r>
         <w:drawing>
           <wp:inline xmlns:a="http://schemas.openxmlformats.org/drawingml/2006/main" xmlns:pic="http://schemas.openxmlformats.org/drawingml/2006/picture">
-            <wp:extent cx="6217920" cy="3342132"/>
+            <wp:extent cx="5852160" cy="3145536"/>
             <wp:docPr id="8" name="Picture 8"/>
             <wp:cNvGraphicFramePr>
               <a:graphicFrameLocks noChangeAspect="1"/>
@@ -557,7 +557,7 @@
                   <pic:spPr>
                     <a:xfrm>
                       <a:off x="0" y="0"/>
-                      <a:ext cx="6217920" cy="3342132"/>
+                      <a:ext cx="5852160" cy="3145536"/>
                     </a:xfrm>
                     <a:prstGeom prst="rect"/>
                   </pic:spPr>
@@ -591,7 +591,7 @@
       <w:r>
         <w:drawing>
           <wp:inline xmlns:a="http://schemas.openxmlformats.org/drawingml/2006/main" xmlns:pic="http://schemas.openxmlformats.org/drawingml/2006/picture">
-            <wp:extent cx="6217920" cy="3342132"/>
+            <wp:extent cx="5852160" cy="3145536"/>
             <wp:docPr id="9" name="Picture 9"/>
             <wp:cNvGraphicFramePr>
               <a:graphicFrameLocks noChangeAspect="1"/>
@@ -612,7 +612,7 @@
                   <pic:spPr>
                     <a:xfrm>
                       <a:off x="0" y="0"/>
-                      <a:ext cx="6217920" cy="3342132"/>
+                      <a:ext cx="5852160" cy="3145536"/>
                     </a:xfrm>
                     <a:prstGeom prst="rect"/>
                   </pic:spPr>
@@ -701,7 +701,7 @@
       <w:r>
         <w:drawing>
           <wp:inline xmlns:a="http://schemas.openxmlformats.org/drawingml/2006/main" xmlns:pic="http://schemas.openxmlformats.org/drawingml/2006/picture">
-            <wp:extent cx="6217920" cy="6621764"/>
+            <wp:extent cx="5852160" cy="6232249"/>
             <wp:docPr id="10" name="Picture 10"/>
             <wp:cNvGraphicFramePr>
               <a:graphicFrameLocks noChangeAspect="1"/>
@@ -722,7 +722,7 @@
                   <pic:spPr>
                     <a:xfrm>
                       <a:off x="0" y="0"/>
-                      <a:ext cx="6217920" cy="6621764"/>
+                      <a:ext cx="5852160" cy="6232249"/>
                     </a:xfrm>
                     <a:prstGeom prst="rect"/>
                   </pic:spPr>
@@ -756,7 +756,7 @@
       <w:r>
         <w:drawing>
           <wp:inline xmlns:a="http://schemas.openxmlformats.org/drawingml/2006/main" xmlns:pic="http://schemas.openxmlformats.org/drawingml/2006/picture">
-            <wp:extent cx="6217920" cy="6621764"/>
+            <wp:extent cx="5852160" cy="6232249"/>
             <wp:docPr id="11" name="Picture 11"/>
             <wp:cNvGraphicFramePr>
               <a:graphicFrameLocks noChangeAspect="1"/>
@@ -777,7 +777,7 @@
                   <pic:spPr>
                     <a:xfrm>
                       <a:off x="0" y="0"/>
-                      <a:ext cx="6217920" cy="6621764"/>
+                      <a:ext cx="5852160" cy="6232249"/>
                     </a:xfrm>
                     <a:prstGeom prst="rect"/>
                   </pic:spPr>
@@ -811,7 +811,7 @@
       <w:r>
         <w:drawing>
           <wp:inline xmlns:a="http://schemas.openxmlformats.org/drawingml/2006/main" xmlns:pic="http://schemas.openxmlformats.org/drawingml/2006/picture">
-            <wp:extent cx="6217920" cy="6621764"/>
+            <wp:extent cx="5852160" cy="6232249"/>
             <wp:docPr id="12" name="Picture 12"/>
             <wp:cNvGraphicFramePr>
               <a:graphicFrameLocks noChangeAspect="1"/>
@@ -832,7 +832,7 @@
                   <pic:spPr>
                     <a:xfrm>
                       <a:off x="0" y="0"/>
-                      <a:ext cx="6217920" cy="6621764"/>
+                      <a:ext cx="5852160" cy="6232249"/>
                     </a:xfrm>
                     <a:prstGeom prst="rect"/>
                   </pic:spPr>
@@ -866,7 +866,7 @@
       <w:r>
         <w:drawing>
           <wp:inline xmlns:a="http://schemas.openxmlformats.org/drawingml/2006/main" xmlns:pic="http://schemas.openxmlformats.org/drawingml/2006/picture">
-            <wp:extent cx="6217920" cy="4681790"/>
+            <wp:extent cx="5852160" cy="4406390"/>
             <wp:docPr id="13" name="Picture 13"/>
             <wp:cNvGraphicFramePr>
               <a:graphicFrameLocks noChangeAspect="1"/>
@@ -887,7 +887,7 @@
                   <pic:spPr>
                     <a:xfrm>
                       <a:off x="0" y="0"/>
-                      <a:ext cx="6217920" cy="4681790"/>
+                      <a:ext cx="5852160" cy="4406390"/>
                     </a:xfrm>
                     <a:prstGeom prst="rect"/>
                   </pic:spPr>
@@ -956,7 +956,7 @@
       <w:r>
         <w:drawing>
           <wp:inline xmlns:a="http://schemas.openxmlformats.org/drawingml/2006/main" xmlns:pic="http://schemas.openxmlformats.org/drawingml/2006/picture">
-            <wp:extent cx="6217920" cy="6621764"/>
+            <wp:extent cx="5852160" cy="6232249"/>
             <wp:docPr id="14" name="Picture 14"/>
             <wp:cNvGraphicFramePr>
               <a:graphicFrameLocks noChangeAspect="1"/>
@@ -977,7 +977,7 @@
                   <pic:spPr>
                     <a:xfrm>
                       <a:off x="0" y="0"/>
-                      <a:ext cx="6217920" cy="6621764"/>
+                      <a:ext cx="5852160" cy="6232249"/>
                     </a:xfrm>
                     <a:prstGeom prst="rect"/>
                   </pic:spPr>
@@ -1011,7 +1011,7 @@
       <w:r>
         <w:drawing>
           <wp:inline xmlns:a="http://schemas.openxmlformats.org/drawingml/2006/main" xmlns:pic="http://schemas.openxmlformats.org/drawingml/2006/picture">
-            <wp:extent cx="6217920" cy="6621764"/>
+            <wp:extent cx="5852160" cy="6232249"/>
             <wp:docPr id="15" name="Picture 15"/>
             <wp:cNvGraphicFramePr>
               <a:graphicFrameLocks noChangeAspect="1"/>
@@ -1032,7 +1032,7 @@
                   <pic:spPr>
                     <a:xfrm>
                       <a:off x="0" y="0"/>
-                      <a:ext cx="6217920" cy="6621764"/>
+                      <a:ext cx="5852160" cy="6232249"/>
                     </a:xfrm>
                     <a:prstGeom prst="rect"/>
                   </pic:spPr>
@@ -1066,7 +1066,7 @@
       <w:r>
         <w:drawing>
           <wp:inline xmlns:a="http://schemas.openxmlformats.org/drawingml/2006/main" xmlns:pic="http://schemas.openxmlformats.org/drawingml/2006/picture">
-            <wp:extent cx="6217920" cy="6621764"/>
+            <wp:extent cx="5852160" cy="6232249"/>
             <wp:docPr id="16" name="Picture 16"/>
             <wp:cNvGraphicFramePr>
               <a:graphicFrameLocks noChangeAspect="1"/>
@@ -1087,7 +1087,7 @@
                   <pic:spPr>
                     <a:xfrm>
                       <a:off x="0" y="0"/>
-                      <a:ext cx="6217920" cy="6621764"/>
+                      <a:ext cx="5852160" cy="6232249"/>
                     </a:xfrm>
                     <a:prstGeom prst="rect"/>
                   </pic:spPr>
@@ -1121,7 +1121,7 @@
       <w:r>
         <w:drawing>
           <wp:inline xmlns:a="http://schemas.openxmlformats.org/drawingml/2006/main" xmlns:pic="http://schemas.openxmlformats.org/drawingml/2006/picture">
-            <wp:extent cx="6217920" cy="3342132"/>
+            <wp:extent cx="5852160" cy="3145536"/>
             <wp:docPr id="17" name="Picture 17"/>
             <wp:cNvGraphicFramePr>
               <a:graphicFrameLocks noChangeAspect="1"/>
@@ -1142,7 +1142,7 @@
                   <pic:spPr>
                     <a:xfrm>
                       <a:off x="0" y="0"/>
-                      <a:ext cx="6217920" cy="3342132"/>
+                      <a:ext cx="5852160" cy="3145536"/>
                     </a:xfrm>
                     <a:prstGeom prst="rect"/>
                   </pic:spPr>
@@ -1169,8 +1169,8 @@
       </w:r>
     </w:p>
     <w:sectPr>
-      <w:pgSz w:w="12240" w:h="15840"/>
-      <w:pgMar w:top="1152" w:right="1152" w:bottom="1152" w:left="1152" w:header="720" w:footer="720" w:gutter="0"/>
+      <w:pgSz w:w="11909" w:h="16834"/>
+      <w:pgMar w:top="1080" w:right="1080" w:bottom="1080" w:left="1080" w:header="720" w:footer="720" w:gutter="0"/>
       <w:cols w:space="720"/>
       <w:docGrid w:linePitch="360"/>
     </w:sectPr>

</xml_diff>